<commit_message>
docs: curso completo 16 semanas + 32 diagramas Mermaid fuente (.mmd) + AGENTS vFinal
</commit_message>
<xml_diff>
--- a/docs/SISEXP_DIAGRAMAS_COMPLETO_v2.docx
+++ b/docs/SISEXP_DIAGRAMAS_COMPLETO_v2.docx
@@ -1,14 +1,14 @@
 
 <file path=word/document.xml><?xml version="1.0" encoding="utf-8"?>
-<w:document xmlns:w="http://schemas.openxmlformats.org/wordprocessingml/2006/main" xmlns:m="http://schemas.openxmlformats.org/officeDocument/2006/math" xmlns:r="http://schemas.openxmlformats.org/officeDocument/2006/relationships" xmlns:o="urn:schemas-microsoft-com:office:office" xmlns:v="urn:schemas-microsoft-com:vml" xmlns:w10="urn:schemas-microsoft-com:office:word" xmlns:a="http://schemas.openxmlformats.org/drawingml/2006/main" xmlns:pic="http://schemas.openxmlformats.org/drawingml/2006/picture" xmlns:wp="http://schemas.openxmlformats.org/drawingml/2006/wordprocessingDrawing">
+<w:document xmlns:wpc="http://schemas.microsoft.com/office/word/2010/wordprocessingCanvas" xmlns:cx="http://schemas.microsoft.com/office/drawing/2014/chartex" xmlns:cx1="http://schemas.microsoft.com/office/drawing/2015/9/8/chartex" xmlns:cx2="http://schemas.microsoft.com/office/drawing/2015/10/21/chartex" xmlns:cx3="http://schemas.microsoft.com/office/drawing/2016/5/9/chartex" xmlns:cx4="http://schemas.microsoft.com/office/drawing/2016/5/10/chartex" xmlns:cx5="http://schemas.microsoft.com/office/drawing/2016/5/11/chartex" xmlns:cx6="http://schemas.microsoft.com/office/drawing/2016/5/12/chartex" xmlns:cx7="http://schemas.microsoft.com/office/drawing/2016/5/13/chartex" xmlns:cx8="http://schemas.microsoft.com/office/drawing/2016/5/14/chartex" xmlns:mc="http://schemas.openxmlformats.org/markup-compatibility/2006" xmlns:aink="http://schemas.microsoft.com/office/drawing/2016/ink" xmlns:am3d="http://schemas.microsoft.com/office/drawing/2017/model3d" xmlns:o="urn:schemas-microsoft-com:office:office" xmlns:oel="http://schemas.microsoft.com/office/2019/extlst" xmlns:r="http://schemas.openxmlformats.org/officeDocument/2006/relationships" xmlns:m="http://schemas.openxmlformats.org/officeDocument/2006/math" xmlns:v="urn:schemas-microsoft-com:vml" xmlns:wp14="http://schemas.microsoft.com/office/word/2010/wordprocessingDrawing" xmlns:wp="http://schemas.openxmlformats.org/drawingml/2006/wordprocessingDrawing" xmlns:w10="urn:schemas-microsoft-com:office:word" xmlns:w="http://schemas.openxmlformats.org/wordprocessingml/2006/main" xmlns:w14="http://schemas.microsoft.com/office/word/2010/wordml" xmlns:w15="http://schemas.microsoft.com/office/word/2012/wordml" xmlns:w16cex="http://schemas.microsoft.com/office/word/2018/wordml/cex" xmlns:w16cid="http://schemas.microsoft.com/office/word/2016/wordml/cid" xmlns:w16="http://schemas.microsoft.com/office/word/2018/wordml" xmlns:w16du="http://schemas.microsoft.com/office/word/2023/wordml/word16du" xmlns:w16sdtdh="http://schemas.microsoft.com/office/word/2020/wordml/sdtdatahash" xmlns:w16sdtfl="http://schemas.microsoft.com/office/word/2024/wordml/sdtformatlock" xmlns:w16se="http://schemas.microsoft.com/office/word/2015/wordml/symex" xmlns:wpg="http://schemas.microsoft.com/office/word/2010/wordprocessingGroup" xmlns:wpi="http://schemas.microsoft.com/office/word/2010/wordprocessingInk" xmlns:wne="http://schemas.microsoft.com/office/word/2006/wordml" xmlns:wps="http://schemas.microsoft.com/office/word/2010/wordprocessingShape" mc:Ignorable="w14 w15 w16se w16cid w16 w16cex w16sdtdh w16sdtfl w16du wp14">
   <w:body>
-    <w:bookmarkStart w:id="132" w:name="X2cdf0b410e0a16b3544c62f163967f46b5db99f"/>
-    <w:p>
-      <w:pPr>
-        <w:pStyle w:val="Heading1"/>
-      </w:pPr>
-      <w:r>
-        <w:t xml:space="preserve">SISEXP-UPLA — Diagramas Completos con Imágenes</w:t>
+    <w:p>
+      <w:pPr>
+        <w:pStyle w:val="Ttulo1"/>
+      </w:pPr>
+      <w:bookmarkStart w:id="0" w:name="X2cdf0b410e0a16b3544c62f163967f46b5db99f"/>
+      <w:r>
+        <w:t>SISEXP-UPLA — Diagramas Completos con Imágenes</w:t>
       </w:r>
     </w:p>
     <w:p>
@@ -16,32 +16,32 @@
         <w:pStyle w:val="FirstParagraph"/>
       </w:pPr>
       <w:r>
-        <w:t xml:space="preserve">Este documento contiene todos los diagramas renderizados como imágenes PNG.</w:t>
-      </w:r>
-    </w:p>
-    <w:p>
-      <w:r>
-        <w:pict>
-          <v:rect style="width:0;height:1.5pt" o:hralign="center" o:hrstd="t" o:hr="t"/>
+        <w:t>Este documento contiene todos los diagramas renderizados como imágenes PNG.</w:t>
+      </w:r>
+    </w:p>
+    <w:p>
+      <w:r>
+        <w:pict w14:anchorId="12A51A4E">
+          <v:rect id="_x0000_i1025" style="width:0;height:1.5pt" o:hralign="center" o:hrstd="t" o:hr="t"/>
         </w:pict>
       </w:r>
     </w:p>
-    <w:bookmarkStart w:id="17" w:name="X32bce29ad56c58e91cb1bbb1e1bb93192caa791"/>
-    <w:p>
-      <w:pPr>
-        <w:pStyle w:val="Heading2"/>
-      </w:pPr>
-      <w:r>
-        <w:t xml:space="preserve">ERS — Especificación de Requisitos de Software</w:t>
-      </w:r>
-    </w:p>
-    <w:bookmarkStart w:id="12" w:name="ers---diagrama-de-actores"/>
-    <w:p>
-      <w:pPr>
-        <w:pStyle w:val="Heading3"/>
-      </w:pPr>
-      <w:r>
-        <w:t xml:space="preserve">ERS - Diagrama de Actores</w:t>
+    <w:p>
+      <w:pPr>
+        <w:pStyle w:val="Ttulo2"/>
+      </w:pPr>
+      <w:bookmarkStart w:id="1" w:name="X32bce29ad56c58e91cb1bbb1e1bb93192caa791"/>
+      <w:r>
+        <w:t>ERS — Especificación de Requisitos de Software</w:t>
+      </w:r>
+    </w:p>
+    <w:p>
+      <w:pPr>
+        <w:pStyle w:val="Ttulo3"/>
+      </w:pPr>
+      <w:bookmarkStart w:id="2" w:name="ers---diagrama-de-actores"/>
+      <w:r>
+        <w:t>ERS - Diagrama de Actores</w:t>
       </w:r>
     </w:p>
     <w:p>
@@ -49,22 +49,26 @@
         <w:pStyle w:val="CaptionedFigure"/>
       </w:pPr>
       <w:r>
+        <w:rPr>
+          <w:noProof/>
+        </w:rPr>
         <w:drawing>
-          <wp:inline>
+          <wp:inline distT="0" distB="0" distL="0" distR="0" wp14:anchorId="62EEE6BE" wp14:editId="02170103">
             <wp:extent cx="5334000" cy="436991"/>
-            <wp:effectExtent b="0" l="0" r="0" t="0"/>
-            <wp:docPr descr="ERS - Diagrama de Actores" title="" id="10" name="Picture"/>
-            <a:graphic>
+            <wp:effectExtent l="0" t="0" r="0" b="0"/>
+            <wp:docPr id="10" name="Picture" descr="ERS - Diagrama de Actores"/>
+            <wp:cNvGraphicFramePr/>
+            <a:graphic xmlns:a="http://schemas.openxmlformats.org/drawingml/2006/main">
               <a:graphicData uri="http://schemas.openxmlformats.org/drawingml/2006/picture">
-                <pic:pic>
+                <pic:pic xmlns:pic="http://schemas.openxmlformats.org/drawingml/2006/picture">
                   <pic:nvPicPr>
-                    <pic:cNvPr descr="images/ERS-01-Actores.png" id="11" name="Picture"/>
+                    <pic:cNvPr id="11" name="Picture" descr="images/ERS-01-Actores.png"/>
                     <pic:cNvPicPr>
-                      <a:picLocks noChangeArrowheads="1" noChangeAspect="1"/>
+                      <a:picLocks noChangeAspect="1" noChangeArrowheads="1"/>
                     </pic:cNvPicPr>
                   </pic:nvPicPr>
                   <pic:blipFill>
-                    <a:blip r:embed="rId9"/>
+                    <a:blip r:embed="rId5"/>
                     <a:stretch>
                       <a:fillRect/>
                     </a:stretch>
@@ -96,17 +100,18 @@
         <w:pStyle w:val="ImageCaption"/>
       </w:pPr>
       <w:r>
-        <w:t xml:space="preserve">ERS - Diagrama de Actores</w:t>
-      </w:r>
-    </w:p>
-    <w:bookmarkEnd w:id="12"/>
-    <w:bookmarkStart w:id="16" w:name="X1279f3d1397f2464710044af2b38a8d3cb2290f"/>
-    <w:p>
-      <w:pPr>
-        <w:pStyle w:val="Heading3"/>
-      </w:pPr>
-      <w:r>
-        <w:t xml:space="preserve">ERS - Diagrama de Clases (Modelo de Dominio)</w:t>
+        <w:t>ERS - Diagrama de Actores</w:t>
+      </w:r>
+    </w:p>
+    <w:p>
+      <w:pPr>
+        <w:pStyle w:val="Ttulo3"/>
+      </w:pPr>
+      <w:bookmarkStart w:id="3" w:name="X1279f3d1397f2464710044af2b38a8d3cb2290f"/>
+      <w:bookmarkEnd w:id="2"/>
+      <w:r>
+        <w:lastRenderedPageBreak/>
+        <w:t>ERS - Diagrama de Clases (Modelo de Dominio)</w:t>
       </w:r>
     </w:p>
     <w:p>
@@ -114,22 +119,26 @@
         <w:pStyle w:val="CaptionedFigure"/>
       </w:pPr>
       <w:r>
+        <w:rPr>
+          <w:noProof/>
+        </w:rPr>
         <w:drawing>
-          <wp:inline>
+          <wp:inline distT="0" distB="0" distL="0" distR="0" wp14:anchorId="478E787A" wp14:editId="3FB0B67E">
             <wp:extent cx="5334000" cy="7072956"/>
-            <wp:effectExtent b="0" l="0" r="0" t="0"/>
-            <wp:docPr descr="ERS - Diagrama de Clases (Modelo de Dominio)" title="" id="14" name="Picture"/>
-            <a:graphic>
+            <wp:effectExtent l="0" t="0" r="0" b="0"/>
+            <wp:docPr id="14" name="Picture" descr="ERS - Diagrama de Clases (Modelo de Dominio)"/>
+            <wp:cNvGraphicFramePr/>
+            <a:graphic xmlns:a="http://schemas.openxmlformats.org/drawingml/2006/main">
               <a:graphicData uri="http://schemas.openxmlformats.org/drawingml/2006/picture">
-                <pic:pic>
+                <pic:pic xmlns:pic="http://schemas.openxmlformats.org/drawingml/2006/picture">
                   <pic:nvPicPr>
-                    <pic:cNvPr descr="images/ERS-02-Diagrama_de_Clases.png" id="15" name="Picture"/>
+                    <pic:cNvPr id="15" name="Picture" descr="images/ERS-02-Diagrama_de_Clases.png"/>
                     <pic:cNvPicPr>
-                      <a:picLocks noChangeArrowheads="1" noChangeAspect="1"/>
+                      <a:picLocks noChangeAspect="1" noChangeArrowheads="1"/>
                     </pic:cNvPicPr>
                   </pic:nvPicPr>
                   <pic:blipFill>
-                    <a:blip r:embed="rId13"/>
+                    <a:blip r:embed="rId6"/>
                     <a:stretch>
                       <a:fillRect/>
                     </a:stretch>
@@ -161,34 +170,35 @@
         <w:pStyle w:val="ImageCaption"/>
       </w:pPr>
       <w:r>
-        <w:t xml:space="preserve">ERS - Diagrama de Clases (Modelo de Dominio)</w:t>
-      </w:r>
-    </w:p>
-    <w:p>
-      <w:r>
-        <w:pict>
-          <v:rect style="width:0;height:1.5pt" o:hralign="center" o:hrstd="t" o:hr="t"/>
+        <w:t>ERS - Diagrama de Clases (Modelo de Dominio)</w:t>
+      </w:r>
+    </w:p>
+    <w:p>
+      <w:r>
+        <w:pict w14:anchorId="7955C5E7">
+          <v:rect id="_x0000_i1026" style="width:0;height:1.5pt" o:hralign="center" o:hrstd="t" o:hr="t"/>
         </w:pict>
       </w:r>
     </w:p>
-    <w:bookmarkEnd w:id="16"/>
-    <w:bookmarkEnd w:id="17"/>
-    <w:bookmarkStart w:id="74" w:name="X061cc5f5a82dc72362f4c60df7a67984534a1fc"/>
-    <w:p>
-      <w:pPr>
-        <w:pStyle w:val="Heading2"/>
-      </w:pPr>
-      <w:r>
-        <w:t xml:space="preserve">BCE — Diagramas de Robustez (Boundary-Control-Entity)</w:t>
-      </w:r>
-    </w:p>
-    <w:bookmarkStart w:id="21" w:name="bce01---iniciar-sesión"/>
-    <w:p>
-      <w:pPr>
-        <w:pStyle w:val="Heading3"/>
-      </w:pPr>
-      <w:r>
-        <w:t xml:space="preserve">BCE01 - Iniciar Sesión</w:t>
+    <w:p>
+      <w:pPr>
+        <w:pStyle w:val="Ttulo2"/>
+      </w:pPr>
+      <w:bookmarkStart w:id="4" w:name="X061cc5f5a82dc72362f4c60df7a67984534a1fc"/>
+      <w:bookmarkEnd w:id="1"/>
+      <w:bookmarkEnd w:id="3"/>
+      <w:r>
+        <w:lastRenderedPageBreak/>
+        <w:t>BCE — Diagramas de Robustez (Boundary-Control-Entity)</w:t>
+      </w:r>
+    </w:p>
+    <w:p>
+      <w:pPr>
+        <w:pStyle w:val="Ttulo3"/>
+      </w:pPr>
+      <w:bookmarkStart w:id="5" w:name="bce01---iniciar-sesión"/>
+      <w:r>
+        <w:t>BCE01 - Iniciar Sesión</w:t>
       </w:r>
     </w:p>
     <w:p>
@@ -196,22 +206,27 @@
         <w:pStyle w:val="CaptionedFigure"/>
       </w:pPr>
       <w:r>
+        <w:rPr>
+          <w:noProof/>
+        </w:rPr>
+        <w:lastRenderedPageBreak/>
         <w:drawing>
-          <wp:inline>
-            <wp:extent cx="5334000" cy="10541644"/>
-            <wp:effectExtent b="0" l="0" r="0" t="0"/>
-            <wp:docPr descr="BCE01 - Iniciar Sesión" title="" id="19" name="Picture"/>
-            <a:graphic>
+          <wp:inline distT="0" distB="0" distL="0" distR="0" wp14:anchorId="6A962FB8" wp14:editId="74573178">
+            <wp:extent cx="4438650" cy="8779510"/>
+            <wp:effectExtent l="0" t="0" r="0" b="0"/>
+            <wp:docPr id="19" name="Picture" descr="BCE01 - Iniciar Sesión"/>
+            <wp:cNvGraphicFramePr/>
+            <a:graphic xmlns:a="http://schemas.openxmlformats.org/drawingml/2006/main">
               <a:graphicData uri="http://schemas.openxmlformats.org/drawingml/2006/picture">
-                <pic:pic>
+                <pic:pic xmlns:pic="http://schemas.openxmlformats.org/drawingml/2006/picture">
                   <pic:nvPicPr>
-                    <pic:cNvPr descr="images/BCE01.png" id="20" name="Picture"/>
+                    <pic:cNvPr id="20" name="Picture" descr="images/BCE01.png"/>
                     <pic:cNvPicPr>
-                      <a:picLocks noChangeArrowheads="1" noChangeAspect="1"/>
+                      <a:picLocks noChangeAspect="1" noChangeArrowheads="1"/>
                     </pic:cNvPicPr>
                   </pic:nvPicPr>
                   <pic:blipFill>
-                    <a:blip r:embed="rId18"/>
+                    <a:blip r:embed="rId7"/>
                     <a:stretch>
                       <a:fillRect/>
                     </a:stretch>
@@ -219,7 +234,7 @@
                   <pic:spPr bwMode="auto">
                     <a:xfrm>
                       <a:off x="0" y="0"/>
-                      <a:ext cx="5334000" cy="10541644"/>
+                      <a:ext cx="4438659" cy="8779528"/>
                     </a:xfrm>
                     <a:prstGeom prst="rect">
                       <a:avLst/>
@@ -243,17 +258,19 @@
         <w:pStyle w:val="ImageCaption"/>
       </w:pPr>
       <w:r>
-        <w:t xml:space="preserve">BCE01 - Iniciar Sesión</w:t>
-      </w:r>
-    </w:p>
-    <w:bookmarkEnd w:id="21"/>
-    <w:bookmarkStart w:id="25" w:name="bce02---ver-dashboard"/>
-    <w:p>
-      <w:pPr>
-        <w:pStyle w:val="Heading3"/>
-      </w:pPr>
-      <w:r>
-        <w:t xml:space="preserve">BCE02 - Ver Dashboard</w:t>
+        <w:lastRenderedPageBreak/>
+        <w:t>BCE01 - Iniciar Sesión</w:t>
+      </w:r>
+    </w:p>
+    <w:p>
+      <w:pPr>
+        <w:pStyle w:val="Ttulo3"/>
+      </w:pPr>
+      <w:bookmarkStart w:id="6" w:name="bce02---ver-dashboard"/>
+      <w:bookmarkEnd w:id="5"/>
+      <w:r>
+        <w:lastRenderedPageBreak/>
+        <w:t>BCE02 - Ver Dashboard</w:t>
       </w:r>
     </w:p>
     <w:p>
@@ -261,22 +278,27 @@
         <w:pStyle w:val="CaptionedFigure"/>
       </w:pPr>
       <w:r>
+        <w:rPr>
+          <w:noProof/>
+        </w:rPr>
+        <w:lastRenderedPageBreak/>
         <w:drawing>
-          <wp:inline>
+          <wp:inline distT="0" distB="0" distL="0" distR="0" wp14:anchorId="1BE09E36" wp14:editId="13224AB9">
             <wp:extent cx="5334000" cy="8223250"/>
-            <wp:effectExtent b="0" l="0" r="0" t="0"/>
-            <wp:docPr descr="BCE02 - Ver Dashboard" title="" id="23" name="Picture"/>
-            <a:graphic>
+            <wp:effectExtent l="0" t="0" r="0" b="0"/>
+            <wp:docPr id="23" name="Picture" descr="BCE02 - Ver Dashboard"/>
+            <wp:cNvGraphicFramePr/>
+            <a:graphic xmlns:a="http://schemas.openxmlformats.org/drawingml/2006/main">
               <a:graphicData uri="http://schemas.openxmlformats.org/drawingml/2006/picture">
-                <pic:pic>
+                <pic:pic xmlns:pic="http://schemas.openxmlformats.org/drawingml/2006/picture">
                   <pic:nvPicPr>
-                    <pic:cNvPr descr="images/BCE02.png" id="24" name="Picture"/>
+                    <pic:cNvPr id="24" name="Picture" descr="images/BCE02.png"/>
                     <pic:cNvPicPr>
-                      <a:picLocks noChangeArrowheads="1" noChangeAspect="1"/>
+                      <a:picLocks noChangeAspect="1" noChangeArrowheads="1"/>
                     </pic:cNvPicPr>
                   </pic:nvPicPr>
                   <pic:blipFill>
-                    <a:blip r:embed="rId22"/>
+                    <a:blip r:embed="rId8"/>
                     <a:stretch>
                       <a:fillRect/>
                     </a:stretch>
@@ -308,17 +330,18 @@
         <w:pStyle w:val="ImageCaption"/>
       </w:pPr>
       <w:r>
-        <w:t xml:space="preserve">BCE02 - Ver Dashboard</w:t>
-      </w:r>
-    </w:p>
-    <w:bookmarkEnd w:id="25"/>
-    <w:bookmarkStart w:id="29" w:name="bce03---crear-expediente"/>
-    <w:p>
-      <w:pPr>
-        <w:pStyle w:val="Heading3"/>
-      </w:pPr>
-      <w:r>
-        <w:t xml:space="preserve">BCE03 - Crear Expediente</w:t>
+        <w:lastRenderedPageBreak/>
+        <w:t>BCE02 - Ver Dashboard</w:t>
+      </w:r>
+    </w:p>
+    <w:p>
+      <w:pPr>
+        <w:pStyle w:val="Ttulo3"/>
+      </w:pPr>
+      <w:bookmarkStart w:id="7" w:name="bce03---crear-expediente"/>
+      <w:bookmarkEnd w:id="6"/>
+      <w:r>
+        <w:t>BCE03 - Crear Expediente</w:t>
       </w:r>
     </w:p>
     <w:p>
@@ -326,22 +349,26 @@
         <w:pStyle w:val="CaptionedFigure"/>
       </w:pPr>
       <w:r>
+        <w:rPr>
+          <w:noProof/>
+        </w:rPr>
         <w:drawing>
-          <wp:inline>
+          <wp:inline distT="0" distB="0" distL="0" distR="0" wp14:anchorId="25994B2A" wp14:editId="04E54754">
             <wp:extent cx="5334000" cy="4162682"/>
-            <wp:effectExtent b="0" l="0" r="0" t="0"/>
-            <wp:docPr descr="BCE03 - Crear Expediente" title="" id="27" name="Picture"/>
-            <a:graphic>
+            <wp:effectExtent l="0" t="0" r="0" b="0"/>
+            <wp:docPr id="27" name="Picture" descr="BCE03 - Crear Expediente"/>
+            <wp:cNvGraphicFramePr/>
+            <a:graphic xmlns:a="http://schemas.openxmlformats.org/drawingml/2006/main">
               <a:graphicData uri="http://schemas.openxmlformats.org/drawingml/2006/picture">
-                <pic:pic>
+                <pic:pic xmlns:pic="http://schemas.openxmlformats.org/drawingml/2006/picture">
                   <pic:nvPicPr>
-                    <pic:cNvPr descr="images/BCE03.png" id="28" name="Picture"/>
+                    <pic:cNvPr id="28" name="Picture" descr="images/BCE03.png"/>
                     <pic:cNvPicPr>
-                      <a:picLocks noChangeArrowheads="1" noChangeAspect="1"/>
+                      <a:picLocks noChangeAspect="1" noChangeArrowheads="1"/>
                     </pic:cNvPicPr>
                   </pic:nvPicPr>
                   <pic:blipFill>
-                    <a:blip r:embed="rId26"/>
+                    <a:blip r:embed="rId9"/>
                     <a:stretch>
                       <a:fillRect/>
                     </a:stretch>
@@ -373,17 +400,18 @@
         <w:pStyle w:val="ImageCaption"/>
       </w:pPr>
       <w:r>
-        <w:t xml:space="preserve">BCE03 - Crear Expediente</w:t>
-      </w:r>
-    </w:p>
-    <w:bookmarkEnd w:id="29"/>
-    <w:bookmarkStart w:id="33" w:name="bce04---cambiar-estado-expediente"/>
-    <w:p>
-      <w:pPr>
-        <w:pStyle w:val="Heading3"/>
-      </w:pPr>
-      <w:r>
-        <w:t xml:space="preserve">BCE04 - Cambiar Estado Expediente</w:t>
+        <w:t>BCE03 - Crear Expediente</w:t>
+      </w:r>
+    </w:p>
+    <w:p>
+      <w:pPr>
+        <w:pStyle w:val="Ttulo3"/>
+      </w:pPr>
+      <w:bookmarkStart w:id="8" w:name="bce04---cambiar-estado-expediente"/>
+      <w:bookmarkEnd w:id="7"/>
+      <w:r>
+        <w:lastRenderedPageBreak/>
+        <w:t>BCE04 - Cambiar Estado Expediente</w:t>
       </w:r>
     </w:p>
     <w:p>
@@ -391,22 +419,26 @@
         <w:pStyle w:val="CaptionedFigure"/>
       </w:pPr>
       <w:r>
+        <w:rPr>
+          <w:noProof/>
+        </w:rPr>
         <w:drawing>
-          <wp:inline>
+          <wp:inline distT="0" distB="0" distL="0" distR="0" wp14:anchorId="6AEE166A" wp14:editId="4ADEC37D">
             <wp:extent cx="5334000" cy="3910398"/>
-            <wp:effectExtent b="0" l="0" r="0" t="0"/>
-            <wp:docPr descr="BCE04 - Cambiar Estado Expediente" title="" id="31" name="Picture"/>
-            <a:graphic>
+            <wp:effectExtent l="0" t="0" r="0" b="0"/>
+            <wp:docPr id="31" name="Picture" descr="BCE04 - Cambiar Estado Expediente"/>
+            <wp:cNvGraphicFramePr/>
+            <a:graphic xmlns:a="http://schemas.openxmlformats.org/drawingml/2006/main">
               <a:graphicData uri="http://schemas.openxmlformats.org/drawingml/2006/picture">
-                <pic:pic>
+                <pic:pic xmlns:pic="http://schemas.openxmlformats.org/drawingml/2006/picture">
                   <pic:nvPicPr>
-                    <pic:cNvPr descr="images/BCE04.png" id="32" name="Picture"/>
+                    <pic:cNvPr id="32" name="Picture" descr="images/BCE04.png"/>
                     <pic:cNvPicPr>
-                      <a:picLocks noChangeArrowheads="1" noChangeAspect="1"/>
+                      <a:picLocks noChangeAspect="1" noChangeArrowheads="1"/>
                     </pic:cNvPicPr>
                   </pic:nvPicPr>
                   <pic:blipFill>
-                    <a:blip r:embed="rId30"/>
+                    <a:blip r:embed="rId10"/>
                     <a:stretch>
                       <a:fillRect/>
                     </a:stretch>
@@ -438,17 +470,18 @@
         <w:pStyle w:val="ImageCaption"/>
       </w:pPr>
       <w:r>
-        <w:t xml:space="preserve">BCE04 - Cambiar Estado Expediente</w:t>
-      </w:r>
-    </w:p>
-    <w:bookmarkEnd w:id="33"/>
-    <w:bookmarkStart w:id="37" w:name="bce05---adjuntar-documento"/>
-    <w:p>
-      <w:pPr>
-        <w:pStyle w:val="Heading3"/>
-      </w:pPr>
-      <w:r>
-        <w:t xml:space="preserve">BCE05 - Adjuntar Documento</w:t>
+        <w:t>BCE04 - Cambiar Estado Expediente</w:t>
+      </w:r>
+    </w:p>
+    <w:p>
+      <w:pPr>
+        <w:pStyle w:val="Ttulo3"/>
+      </w:pPr>
+      <w:bookmarkStart w:id="9" w:name="bce05---adjuntar-documento"/>
+      <w:bookmarkEnd w:id="8"/>
+      <w:r>
+        <w:lastRenderedPageBreak/>
+        <w:t>BCE05 - Adjuntar Documento</w:t>
       </w:r>
     </w:p>
     <w:p>
@@ -456,22 +489,27 @@
         <w:pStyle w:val="CaptionedFigure"/>
       </w:pPr>
       <w:r>
+        <w:rPr>
+          <w:noProof/>
+        </w:rPr>
+        <w:lastRenderedPageBreak/>
         <w:drawing>
-          <wp:inline>
+          <wp:inline distT="0" distB="0" distL="0" distR="0" wp14:anchorId="5EFE6A4D" wp14:editId="6140E848">
             <wp:extent cx="5067300" cy="12852400"/>
-            <wp:effectExtent b="0" l="0" r="0" t="0"/>
-            <wp:docPr descr="BCE05 - Adjuntar Documento" title="" id="35" name="Picture"/>
-            <a:graphic>
+            <wp:effectExtent l="0" t="0" r="0" b="0"/>
+            <wp:docPr id="35" name="Picture" descr="BCE05 - Adjuntar Documento"/>
+            <wp:cNvGraphicFramePr/>
+            <a:graphic xmlns:a="http://schemas.openxmlformats.org/drawingml/2006/main">
               <a:graphicData uri="http://schemas.openxmlformats.org/drawingml/2006/picture">
-                <pic:pic>
+                <pic:pic xmlns:pic="http://schemas.openxmlformats.org/drawingml/2006/picture">
                   <pic:nvPicPr>
-                    <pic:cNvPr descr="images/BCE05.png" id="36" name="Picture"/>
+                    <pic:cNvPr id="36" name="Picture" descr="images/BCE05.png"/>
                     <pic:cNvPicPr>
-                      <a:picLocks noChangeArrowheads="1" noChangeAspect="1"/>
+                      <a:picLocks noChangeAspect="1" noChangeArrowheads="1"/>
                     </pic:cNvPicPr>
                   </pic:nvPicPr>
                   <pic:blipFill>
-                    <a:blip r:embed="rId34"/>
+                    <a:blip r:embed="rId11"/>
                     <a:stretch>
                       <a:fillRect/>
                     </a:stretch>
@@ -503,17 +541,19 @@
         <w:pStyle w:val="ImageCaption"/>
       </w:pPr>
       <w:r>
-        <w:t xml:space="preserve">BCE05 - Adjuntar Documento</w:t>
-      </w:r>
-    </w:p>
-    <w:bookmarkEnd w:id="37"/>
-    <w:bookmarkStart w:id="41" w:name="bce06---gestionar-techo-presupuestal"/>
-    <w:p>
-      <w:pPr>
-        <w:pStyle w:val="Heading3"/>
-      </w:pPr>
-      <w:r>
-        <w:t xml:space="preserve">BCE06 - Gestionar Techo Presupuestal</w:t>
+        <w:lastRenderedPageBreak/>
+        <w:t>BCE05 - Adjuntar Documento</w:t>
+      </w:r>
+    </w:p>
+    <w:p>
+      <w:pPr>
+        <w:pStyle w:val="Ttulo3"/>
+      </w:pPr>
+      <w:bookmarkStart w:id="10" w:name="bce06---gestionar-techo-presupuestal"/>
+      <w:bookmarkEnd w:id="9"/>
+      <w:r>
+        <w:lastRenderedPageBreak/>
+        <w:t>BCE06 - Gestionar Techo Presupuestal</w:t>
       </w:r>
     </w:p>
     <w:p>
@@ -521,22 +561,27 @@
         <w:pStyle w:val="CaptionedFigure"/>
       </w:pPr>
       <w:r>
+        <w:rPr>
+          <w:noProof/>
+        </w:rPr>
+        <w:lastRenderedPageBreak/>
         <w:drawing>
-          <wp:inline>
+          <wp:inline distT="0" distB="0" distL="0" distR="0" wp14:anchorId="121C09F8" wp14:editId="58B73394">
             <wp:extent cx="5334000" cy="8974149"/>
-            <wp:effectExtent b="0" l="0" r="0" t="0"/>
-            <wp:docPr descr="BCE06 - Gestionar Techo Presupuestal" title="" id="39" name="Picture"/>
-            <a:graphic>
+            <wp:effectExtent l="0" t="0" r="0" b="0"/>
+            <wp:docPr id="39" name="Picture" descr="BCE06 - Gestionar Techo Presupuestal"/>
+            <wp:cNvGraphicFramePr/>
+            <a:graphic xmlns:a="http://schemas.openxmlformats.org/drawingml/2006/main">
               <a:graphicData uri="http://schemas.openxmlformats.org/drawingml/2006/picture">
-                <pic:pic>
+                <pic:pic xmlns:pic="http://schemas.openxmlformats.org/drawingml/2006/picture">
                   <pic:nvPicPr>
-                    <pic:cNvPr descr="images/BCE06.png" id="40" name="Picture"/>
+                    <pic:cNvPr id="40" name="Picture" descr="images/BCE06.png"/>
                     <pic:cNvPicPr>
-                      <a:picLocks noChangeArrowheads="1" noChangeAspect="1"/>
+                      <a:picLocks noChangeAspect="1" noChangeArrowheads="1"/>
                     </pic:cNvPicPr>
                   </pic:nvPicPr>
                   <pic:blipFill>
-                    <a:blip r:embed="rId38"/>
+                    <a:blip r:embed="rId12"/>
                     <a:stretch>
                       <a:fillRect/>
                     </a:stretch>
@@ -568,17 +613,19 @@
         <w:pStyle w:val="ImageCaption"/>
       </w:pPr>
       <w:r>
-        <w:t xml:space="preserve">BCE06 - Gestionar Techo Presupuestal</w:t>
-      </w:r>
-    </w:p>
-    <w:bookmarkEnd w:id="41"/>
-    <w:bookmarkStart w:id="45" w:name="bce07---gestionar-actividad-poi"/>
-    <w:p>
-      <w:pPr>
-        <w:pStyle w:val="Heading3"/>
-      </w:pPr>
-      <w:r>
-        <w:t xml:space="preserve">BCE07 - Gestionar Actividad POI</w:t>
+        <w:lastRenderedPageBreak/>
+        <w:t>BCE06 - Gestionar Techo Presupuestal</w:t>
+      </w:r>
+    </w:p>
+    <w:p>
+      <w:pPr>
+        <w:pStyle w:val="Ttulo3"/>
+      </w:pPr>
+      <w:bookmarkStart w:id="11" w:name="bce07---gestionar-actividad-poi"/>
+      <w:bookmarkEnd w:id="10"/>
+      <w:r>
+        <w:lastRenderedPageBreak/>
+        <w:t>BCE07 - Gestionar Actividad POI</w:t>
       </w:r>
     </w:p>
     <w:p>
@@ -586,22 +633,27 @@
         <w:pStyle w:val="CaptionedFigure"/>
       </w:pPr>
       <w:r>
+        <w:rPr>
+          <w:noProof/>
+        </w:rPr>
+        <w:lastRenderedPageBreak/>
         <w:drawing>
-          <wp:inline>
+          <wp:inline distT="0" distB="0" distL="0" distR="0" wp14:anchorId="07428F5C" wp14:editId="1F8260B1">
             <wp:extent cx="5334000" cy="8321348"/>
-            <wp:effectExtent b="0" l="0" r="0" t="0"/>
-            <wp:docPr descr="BCE07 - Gestionar Actividad POI" title="" id="43" name="Picture"/>
-            <a:graphic>
+            <wp:effectExtent l="0" t="0" r="0" b="0"/>
+            <wp:docPr id="43" name="Picture" descr="BCE07 - Gestionar Actividad POI"/>
+            <wp:cNvGraphicFramePr/>
+            <a:graphic xmlns:a="http://schemas.openxmlformats.org/drawingml/2006/main">
               <a:graphicData uri="http://schemas.openxmlformats.org/drawingml/2006/picture">
-                <pic:pic>
+                <pic:pic xmlns:pic="http://schemas.openxmlformats.org/drawingml/2006/picture">
                   <pic:nvPicPr>
-                    <pic:cNvPr descr="images/BCE07.png" id="44" name="Picture"/>
+                    <pic:cNvPr id="44" name="Picture" descr="images/BCE07.png"/>
                     <pic:cNvPicPr>
-                      <a:picLocks noChangeArrowheads="1" noChangeAspect="1"/>
+                      <a:picLocks noChangeAspect="1" noChangeArrowheads="1"/>
                     </pic:cNvPicPr>
                   </pic:nvPicPr>
                   <pic:blipFill>
-                    <a:blip r:embed="rId42"/>
+                    <a:blip r:embed="rId13"/>
                     <a:stretch>
                       <a:fillRect/>
                     </a:stretch>
@@ -633,17 +685,19 @@
         <w:pStyle w:val="ImageCaption"/>
       </w:pPr>
       <w:r>
-        <w:t xml:space="preserve">BCE07 - Gestionar Actividad POI</w:t>
-      </w:r>
-    </w:p>
-    <w:bookmarkEnd w:id="45"/>
-    <w:bookmarkStart w:id="49" w:name="bce08---gestionar-necesidad-pap"/>
-    <w:p>
-      <w:pPr>
-        <w:pStyle w:val="Heading3"/>
-      </w:pPr>
-      <w:r>
-        <w:t xml:space="preserve">BCE08 - Gestionar Necesidad PAP</w:t>
+        <w:lastRenderedPageBreak/>
+        <w:t>BCE07 - Gestionar Actividad POI</w:t>
+      </w:r>
+    </w:p>
+    <w:p>
+      <w:pPr>
+        <w:pStyle w:val="Ttulo3"/>
+      </w:pPr>
+      <w:bookmarkStart w:id="12" w:name="bce08---gestionar-necesidad-pap"/>
+      <w:bookmarkEnd w:id="11"/>
+      <w:r>
+        <w:lastRenderedPageBreak/>
+        <w:t>BCE08 - Gestionar Necesidad PAP</w:t>
       </w:r>
     </w:p>
     <w:p>
@@ -651,22 +705,27 @@
         <w:pStyle w:val="CaptionedFigure"/>
       </w:pPr>
       <w:r>
+        <w:rPr>
+          <w:noProof/>
+        </w:rPr>
+        <w:lastRenderedPageBreak/>
         <w:drawing>
-          <wp:inline>
+          <wp:inline distT="0" distB="0" distL="0" distR="0" wp14:anchorId="67C4167A" wp14:editId="689F3EA7">
             <wp:extent cx="5334000" cy="8607862"/>
-            <wp:effectExtent b="0" l="0" r="0" t="0"/>
-            <wp:docPr descr="BCE08 - Gestionar Necesidad PAP" title="" id="47" name="Picture"/>
-            <a:graphic>
+            <wp:effectExtent l="0" t="0" r="0" b="0"/>
+            <wp:docPr id="47" name="Picture" descr="BCE08 - Gestionar Necesidad PAP"/>
+            <wp:cNvGraphicFramePr/>
+            <a:graphic xmlns:a="http://schemas.openxmlformats.org/drawingml/2006/main">
               <a:graphicData uri="http://schemas.openxmlformats.org/drawingml/2006/picture">
-                <pic:pic>
+                <pic:pic xmlns:pic="http://schemas.openxmlformats.org/drawingml/2006/picture">
                   <pic:nvPicPr>
-                    <pic:cNvPr descr="images/BCE08.png" id="48" name="Picture"/>
+                    <pic:cNvPr id="48" name="Picture" descr="images/BCE08.png"/>
                     <pic:cNvPicPr>
-                      <a:picLocks noChangeArrowheads="1" noChangeAspect="1"/>
+                      <a:picLocks noChangeAspect="1" noChangeArrowheads="1"/>
                     </pic:cNvPicPr>
                   </pic:nvPicPr>
                   <pic:blipFill>
-                    <a:blip r:embed="rId46"/>
+                    <a:blip r:embed="rId14"/>
                     <a:stretch>
                       <a:fillRect/>
                     </a:stretch>
@@ -698,17 +757,18 @@
         <w:pStyle w:val="ImageCaption"/>
       </w:pPr>
       <w:r>
-        <w:t xml:space="preserve">BCE08 - Gestionar Necesidad PAP</w:t>
-      </w:r>
-    </w:p>
-    <w:bookmarkEnd w:id="49"/>
-    <w:bookmarkStart w:id="53" w:name="bce09---gestionar-nota-modificatoria"/>
-    <w:p>
-      <w:pPr>
-        <w:pStyle w:val="Heading3"/>
-      </w:pPr>
-      <w:r>
-        <w:t xml:space="preserve">BCE09 - Gestionar Nota Modificatoria</w:t>
+        <w:lastRenderedPageBreak/>
+        <w:t>BCE08 - Gestionar Necesidad PAP</w:t>
+      </w:r>
+    </w:p>
+    <w:p>
+      <w:pPr>
+        <w:pStyle w:val="Ttulo3"/>
+      </w:pPr>
+      <w:bookmarkStart w:id="13" w:name="bce09---gestionar-nota-modificatoria"/>
+      <w:bookmarkEnd w:id="12"/>
+      <w:r>
+        <w:t>BCE09 - Gestionar Nota Modificatoria</w:t>
       </w:r>
     </w:p>
     <w:p>
@@ -716,22 +776,26 @@
         <w:pStyle w:val="CaptionedFigure"/>
       </w:pPr>
       <w:r>
+        <w:rPr>
+          <w:noProof/>
+        </w:rPr>
         <w:drawing>
-          <wp:inline>
+          <wp:inline distT="0" distB="0" distL="0" distR="0" wp14:anchorId="403381EE" wp14:editId="130C6B91">
             <wp:extent cx="5334000" cy="4815917"/>
-            <wp:effectExtent b="0" l="0" r="0" t="0"/>
-            <wp:docPr descr="BCE09 - Gestionar Nota Modificatoria" title="" id="51" name="Picture"/>
-            <a:graphic>
+            <wp:effectExtent l="0" t="0" r="0" b="0"/>
+            <wp:docPr id="51" name="Picture" descr="BCE09 - Gestionar Nota Modificatoria"/>
+            <wp:cNvGraphicFramePr/>
+            <a:graphic xmlns:a="http://schemas.openxmlformats.org/drawingml/2006/main">
               <a:graphicData uri="http://schemas.openxmlformats.org/drawingml/2006/picture">
-                <pic:pic>
+                <pic:pic xmlns:pic="http://schemas.openxmlformats.org/drawingml/2006/picture">
                   <pic:nvPicPr>
-                    <pic:cNvPr descr="images/BCE09.png" id="52" name="Picture"/>
+                    <pic:cNvPr id="52" name="Picture" descr="images/BCE09.png"/>
                     <pic:cNvPicPr>
-                      <a:picLocks noChangeArrowheads="1" noChangeAspect="1"/>
+                      <a:picLocks noChangeAspect="1" noChangeArrowheads="1"/>
                     </pic:cNvPicPr>
                   </pic:nvPicPr>
                   <pic:blipFill>
-                    <a:blip r:embed="rId50"/>
+                    <a:blip r:embed="rId15"/>
                     <a:stretch>
                       <a:fillRect/>
                     </a:stretch>
@@ -763,17 +827,18 @@
         <w:pStyle w:val="ImageCaption"/>
       </w:pPr>
       <w:r>
-        <w:t xml:space="preserve">BCE09 - Gestionar Nota Modificatoria</w:t>
-      </w:r>
-    </w:p>
-    <w:bookmarkEnd w:id="53"/>
-    <w:bookmarkStart w:id="57" w:name="bce10---ver-reportes"/>
-    <w:p>
-      <w:pPr>
-        <w:pStyle w:val="Heading3"/>
-      </w:pPr>
-      <w:r>
-        <w:t xml:space="preserve">BCE10 - Ver Reportes</w:t>
+        <w:t>BCE09 - Gestionar Nota Modificatoria</w:t>
+      </w:r>
+    </w:p>
+    <w:p>
+      <w:pPr>
+        <w:pStyle w:val="Ttulo3"/>
+      </w:pPr>
+      <w:bookmarkStart w:id="14" w:name="bce10---ver-reportes"/>
+      <w:bookmarkEnd w:id="13"/>
+      <w:r>
+        <w:lastRenderedPageBreak/>
+        <w:t>BCE10 - Ver Reportes</w:t>
       </w:r>
     </w:p>
     <w:p>
@@ -781,22 +846,27 @@
         <w:pStyle w:val="CaptionedFigure"/>
       </w:pPr>
       <w:r>
+        <w:rPr>
+          <w:noProof/>
+        </w:rPr>
+        <w:lastRenderedPageBreak/>
         <w:drawing>
-          <wp:inline>
+          <wp:inline distT="0" distB="0" distL="0" distR="0" wp14:anchorId="5E8766ED" wp14:editId="0B84765B">
             <wp:extent cx="5334000" cy="8242040"/>
-            <wp:effectExtent b="0" l="0" r="0" t="0"/>
-            <wp:docPr descr="BCE10 - Ver Reportes" title="" id="55" name="Picture"/>
-            <a:graphic>
+            <wp:effectExtent l="0" t="0" r="0" b="0"/>
+            <wp:docPr id="55" name="Picture" descr="BCE10 - Ver Reportes"/>
+            <wp:cNvGraphicFramePr/>
+            <a:graphic xmlns:a="http://schemas.openxmlformats.org/drawingml/2006/main">
               <a:graphicData uri="http://schemas.openxmlformats.org/drawingml/2006/picture">
-                <pic:pic>
+                <pic:pic xmlns:pic="http://schemas.openxmlformats.org/drawingml/2006/picture">
                   <pic:nvPicPr>
-                    <pic:cNvPr descr="images/BCE10.png" id="56" name="Picture"/>
+                    <pic:cNvPr id="56" name="Picture" descr="images/BCE10.png"/>
                     <pic:cNvPicPr>
-                      <a:picLocks noChangeArrowheads="1" noChangeAspect="1"/>
+                      <a:picLocks noChangeAspect="1" noChangeArrowheads="1"/>
                     </pic:cNvPicPr>
                   </pic:nvPicPr>
                   <pic:blipFill>
-                    <a:blip r:embed="rId54"/>
+                    <a:blip r:embed="rId16"/>
                     <a:stretch>
                       <a:fillRect/>
                     </a:stretch>
@@ -828,17 +898,19 @@
         <w:pStyle w:val="ImageCaption"/>
       </w:pPr>
       <w:r>
-        <w:t xml:space="preserve">BCE10 - Ver Reportes</w:t>
-      </w:r>
-    </w:p>
-    <w:bookmarkEnd w:id="57"/>
-    <w:bookmarkStart w:id="61" w:name="bce11---gestionar-usuarios"/>
-    <w:p>
-      <w:pPr>
-        <w:pStyle w:val="Heading3"/>
-      </w:pPr>
-      <w:r>
-        <w:t xml:space="preserve">BCE11 - Gestionar Usuarios</w:t>
+        <w:lastRenderedPageBreak/>
+        <w:t>BCE10 - Ver Reportes</w:t>
+      </w:r>
+    </w:p>
+    <w:p>
+      <w:pPr>
+        <w:pStyle w:val="Ttulo3"/>
+      </w:pPr>
+      <w:bookmarkStart w:id="15" w:name="bce11---gestionar-usuarios"/>
+      <w:bookmarkEnd w:id="14"/>
+      <w:r>
+        <w:lastRenderedPageBreak/>
+        <w:t>BCE11 - Gestionar Usuarios</w:t>
       </w:r>
     </w:p>
     <w:p>
@@ -846,22 +918,27 @@
         <w:pStyle w:val="CaptionedFigure"/>
       </w:pPr>
       <w:r>
+        <w:rPr>
+          <w:noProof/>
+        </w:rPr>
+        <w:lastRenderedPageBreak/>
         <w:drawing>
-          <wp:inline>
+          <wp:inline distT="0" distB="0" distL="0" distR="0" wp14:anchorId="73BD35E1" wp14:editId="3CC8FB1D">
             <wp:extent cx="3060700" cy="13462000"/>
-            <wp:effectExtent b="0" l="0" r="0" t="0"/>
-            <wp:docPr descr="BCE11 - Gestionar Usuarios" title="" id="59" name="Picture"/>
-            <a:graphic>
+            <wp:effectExtent l="0" t="0" r="0" b="0"/>
+            <wp:docPr id="59" name="Picture" descr="BCE11 - Gestionar Usuarios"/>
+            <wp:cNvGraphicFramePr/>
+            <a:graphic xmlns:a="http://schemas.openxmlformats.org/drawingml/2006/main">
               <a:graphicData uri="http://schemas.openxmlformats.org/drawingml/2006/picture">
-                <pic:pic>
+                <pic:pic xmlns:pic="http://schemas.openxmlformats.org/drawingml/2006/picture">
                   <pic:nvPicPr>
-                    <pic:cNvPr descr="images/BCE11.png" id="60" name="Picture"/>
+                    <pic:cNvPr id="60" name="Picture" descr="images/BCE11.png"/>
                     <pic:cNvPicPr>
-                      <a:picLocks noChangeArrowheads="1" noChangeAspect="1"/>
+                      <a:picLocks noChangeAspect="1" noChangeArrowheads="1"/>
                     </pic:cNvPicPr>
                   </pic:nvPicPr>
                   <pic:blipFill>
-                    <a:blip r:embed="rId58"/>
+                    <a:blip r:embed="rId17"/>
                     <a:stretch>
                       <a:fillRect/>
                     </a:stretch>
@@ -893,17 +970,19 @@
         <w:pStyle w:val="ImageCaption"/>
       </w:pPr>
       <w:r>
-        <w:t xml:space="preserve">BCE11 - Gestionar Usuarios</w:t>
-      </w:r>
-    </w:p>
-    <w:bookmarkEnd w:id="61"/>
-    <w:bookmarkStart w:id="65" w:name="bce12---gestionar-notificaciones"/>
-    <w:p>
-      <w:pPr>
-        <w:pStyle w:val="Heading3"/>
-      </w:pPr>
-      <w:r>
-        <w:t xml:space="preserve">BCE12 - Gestionar Notificaciones</w:t>
+        <w:lastRenderedPageBreak/>
+        <w:t>BCE11 - Gestionar Usuarios</w:t>
+      </w:r>
+    </w:p>
+    <w:p>
+      <w:pPr>
+        <w:pStyle w:val="Ttulo3"/>
+      </w:pPr>
+      <w:bookmarkStart w:id="16" w:name="bce12---gestionar-notificaciones"/>
+      <w:bookmarkEnd w:id="15"/>
+      <w:r>
+        <w:lastRenderedPageBreak/>
+        <w:t>BCE12 - Gestionar Notificaciones</w:t>
       </w:r>
     </w:p>
     <w:p>
@@ -911,22 +990,27 @@
         <w:pStyle w:val="CaptionedFigure"/>
       </w:pPr>
       <w:r>
+        <w:rPr>
+          <w:noProof/>
+        </w:rPr>
+        <w:lastRenderedPageBreak/>
         <w:drawing>
-          <wp:inline>
+          <wp:inline distT="0" distB="0" distL="0" distR="0" wp14:anchorId="0556637A" wp14:editId="5E32EDED">
             <wp:extent cx="3479800" cy="12852400"/>
-            <wp:effectExtent b="0" l="0" r="0" t="0"/>
-            <wp:docPr descr="BCE12 - Gestionar Notificaciones" title="" id="63" name="Picture"/>
-            <a:graphic>
+            <wp:effectExtent l="0" t="0" r="0" b="0"/>
+            <wp:docPr id="63" name="Picture" descr="BCE12 - Gestionar Notificaciones"/>
+            <wp:cNvGraphicFramePr/>
+            <a:graphic xmlns:a="http://schemas.openxmlformats.org/drawingml/2006/main">
               <a:graphicData uri="http://schemas.openxmlformats.org/drawingml/2006/picture">
-                <pic:pic>
+                <pic:pic xmlns:pic="http://schemas.openxmlformats.org/drawingml/2006/picture">
                   <pic:nvPicPr>
-                    <pic:cNvPr descr="images/BCE12.png" id="64" name="Picture"/>
+                    <pic:cNvPr id="64" name="Picture" descr="images/BCE12.png"/>
                     <pic:cNvPicPr>
-                      <a:picLocks noChangeArrowheads="1" noChangeAspect="1"/>
+                      <a:picLocks noChangeAspect="1" noChangeArrowheads="1"/>
                     </pic:cNvPicPr>
                   </pic:nvPicPr>
                   <pic:blipFill>
-                    <a:blip r:embed="rId62"/>
+                    <a:blip r:embed="rId18"/>
                     <a:stretch>
                       <a:fillRect/>
                     </a:stretch>
@@ -958,17 +1042,19 @@
         <w:pStyle w:val="ImageCaption"/>
       </w:pPr>
       <w:r>
-        <w:t xml:space="preserve">BCE12 - Gestionar Notificaciones</w:t>
-      </w:r>
-    </w:p>
-    <w:bookmarkEnd w:id="65"/>
-    <w:bookmarkStart w:id="69" w:name="bce13---rastrear-expediente-público"/>
-    <w:p>
-      <w:pPr>
-        <w:pStyle w:val="Heading3"/>
-      </w:pPr>
-      <w:r>
-        <w:t xml:space="preserve">BCE13 - Rastrear Expediente (Público)</w:t>
+        <w:lastRenderedPageBreak/>
+        <w:t>BCE12 - Gestionar Notificaciones</w:t>
+      </w:r>
+    </w:p>
+    <w:p>
+      <w:pPr>
+        <w:pStyle w:val="Ttulo3"/>
+      </w:pPr>
+      <w:bookmarkStart w:id="17" w:name="bce13---rastrear-expediente-público"/>
+      <w:bookmarkEnd w:id="16"/>
+      <w:r>
+        <w:lastRenderedPageBreak/>
+        <w:t>BCE13 - Rastrear Expediente (Público)</w:t>
       </w:r>
     </w:p>
     <w:p>
@@ -976,22 +1062,27 @@
         <w:pStyle w:val="CaptionedFigure"/>
       </w:pPr>
       <w:r>
+        <w:rPr>
+          <w:noProof/>
+        </w:rPr>
+        <w:lastRenderedPageBreak/>
         <w:drawing>
-          <wp:inline>
+          <wp:inline distT="0" distB="0" distL="0" distR="0" wp14:anchorId="62DE7630" wp14:editId="0B68E828">
             <wp:extent cx="4025900" cy="11633200"/>
-            <wp:effectExtent b="0" l="0" r="0" t="0"/>
-            <wp:docPr descr="BCE13 - Rastrear Expediente (Público)" title="" id="67" name="Picture"/>
-            <a:graphic>
+            <wp:effectExtent l="0" t="0" r="0" b="0"/>
+            <wp:docPr id="67" name="Picture" descr="BCE13 - Rastrear Expediente (Público)"/>
+            <wp:cNvGraphicFramePr/>
+            <a:graphic xmlns:a="http://schemas.openxmlformats.org/drawingml/2006/main">
               <a:graphicData uri="http://schemas.openxmlformats.org/drawingml/2006/picture">
-                <pic:pic>
+                <pic:pic xmlns:pic="http://schemas.openxmlformats.org/drawingml/2006/picture">
                   <pic:nvPicPr>
-                    <pic:cNvPr descr="images/BCE13.png" id="68" name="Picture"/>
+                    <pic:cNvPr id="68" name="Picture" descr="images/BCE13.png"/>
                     <pic:cNvPicPr>
-                      <a:picLocks noChangeArrowheads="1" noChangeAspect="1"/>
+                      <a:picLocks noChangeAspect="1" noChangeArrowheads="1"/>
                     </pic:cNvPicPr>
                   </pic:nvPicPr>
                   <pic:blipFill>
-                    <a:blip r:embed="rId66"/>
+                    <a:blip r:embed="rId19"/>
                     <a:stretch>
                       <a:fillRect/>
                     </a:stretch>
@@ -1023,17 +1114,19 @@
         <w:pStyle w:val="ImageCaption"/>
       </w:pPr>
       <w:r>
-        <w:t xml:space="preserve">BCE13 - Rastrear Expediente (Público)</w:t>
-      </w:r>
-    </w:p>
-    <w:bookmarkEnd w:id="69"/>
-    <w:bookmarkStart w:id="73" w:name="bce14---cerrar-sesión"/>
-    <w:p>
-      <w:pPr>
-        <w:pStyle w:val="Heading3"/>
-      </w:pPr>
-      <w:r>
-        <w:t xml:space="preserve">BCE14 - Cerrar Sesión</w:t>
+        <w:lastRenderedPageBreak/>
+        <w:t>BCE13 - Rastrear Expediente (Público)</w:t>
+      </w:r>
+    </w:p>
+    <w:p>
+      <w:pPr>
+        <w:pStyle w:val="Ttulo3"/>
+      </w:pPr>
+      <w:bookmarkStart w:id="18" w:name="bce14---cerrar-sesión"/>
+      <w:bookmarkEnd w:id="17"/>
+      <w:r>
+        <w:lastRenderedPageBreak/>
+        <w:t>BCE14 - Cerrar Sesión</w:t>
       </w:r>
     </w:p>
     <w:p>
@@ -1041,22 +1134,27 @@
         <w:pStyle w:val="CaptionedFigure"/>
       </w:pPr>
       <w:r>
+        <w:rPr>
+          <w:noProof/>
+        </w:rPr>
+        <w:lastRenderedPageBreak/>
         <w:drawing>
-          <wp:inline>
+          <wp:inline distT="0" distB="0" distL="0" distR="0" wp14:anchorId="529EFC67" wp14:editId="3845EC43">
             <wp:extent cx="4445000" cy="8407400"/>
-            <wp:effectExtent b="0" l="0" r="0" t="0"/>
-            <wp:docPr descr="BCE14 - Cerrar Sesión" title="" id="71" name="Picture"/>
-            <a:graphic>
+            <wp:effectExtent l="0" t="0" r="0" b="0"/>
+            <wp:docPr id="71" name="Picture" descr="BCE14 - Cerrar Sesión"/>
+            <wp:cNvGraphicFramePr/>
+            <a:graphic xmlns:a="http://schemas.openxmlformats.org/drawingml/2006/main">
               <a:graphicData uri="http://schemas.openxmlformats.org/drawingml/2006/picture">
-                <pic:pic>
+                <pic:pic xmlns:pic="http://schemas.openxmlformats.org/drawingml/2006/picture">
                   <pic:nvPicPr>
-                    <pic:cNvPr descr="images/BCE14.png" id="72" name="Picture"/>
+                    <pic:cNvPr id="72" name="Picture" descr="images/BCE14.png"/>
                     <pic:cNvPicPr>
-                      <a:picLocks noChangeArrowheads="1" noChangeAspect="1"/>
+                      <a:picLocks noChangeAspect="1" noChangeArrowheads="1"/>
                     </pic:cNvPicPr>
                   </pic:nvPicPr>
                   <pic:blipFill>
-                    <a:blip r:embed="rId70"/>
+                    <a:blip r:embed="rId20"/>
                     <a:stretch>
                       <a:fillRect/>
                     </a:stretch>
@@ -1088,34 +1186,36 @@
         <w:pStyle w:val="ImageCaption"/>
       </w:pPr>
       <w:r>
-        <w:t xml:space="preserve">BCE14 - Cerrar Sesión</w:t>
-      </w:r>
-    </w:p>
-    <w:p>
-      <w:r>
-        <w:pict>
-          <v:rect style="width:0;height:1.5pt" o:hralign="center" o:hrstd="t" o:hr="t"/>
+        <w:lastRenderedPageBreak/>
+        <w:t>BCE14 - Cerrar Sesión</w:t>
+      </w:r>
+    </w:p>
+    <w:p>
+      <w:r>
+        <w:pict w14:anchorId="6D858EF1">
+          <v:rect id="_x0000_i1027" style="width:0;height:1.5pt" o:hralign="center" o:hrstd="t" o:hr="t"/>
         </w:pict>
       </w:r>
     </w:p>
-    <w:bookmarkEnd w:id="73"/>
-    <w:bookmarkEnd w:id="74"/>
-    <w:bookmarkStart w:id="131" w:name="ssd-diagramas-de-secuencia-del-sistema"/>
-    <w:p>
-      <w:pPr>
-        <w:pStyle w:val="Heading2"/>
-      </w:pPr>
-      <w:r>
-        <w:t xml:space="preserve">SSD — Diagramas de Secuencia del Sistema</w:t>
-      </w:r>
-    </w:p>
-    <w:bookmarkStart w:id="78" w:name="ssd-cu01---iniciar-sesión"/>
-    <w:p>
-      <w:pPr>
-        <w:pStyle w:val="Heading3"/>
-      </w:pPr>
-      <w:r>
-        <w:t xml:space="preserve">SSD-CU01 - Iniciar Sesión</w:t>
+    <w:p>
+      <w:pPr>
+        <w:pStyle w:val="Ttulo2"/>
+      </w:pPr>
+      <w:bookmarkStart w:id="19" w:name="ssd-diagramas-de-secuencia-del-sistema"/>
+      <w:bookmarkEnd w:id="4"/>
+      <w:bookmarkEnd w:id="18"/>
+      <w:r>
+        <w:lastRenderedPageBreak/>
+        <w:t>SSD — Diagramas de Secuencia del Sistema</w:t>
+      </w:r>
+    </w:p>
+    <w:p>
+      <w:pPr>
+        <w:pStyle w:val="Ttulo3"/>
+      </w:pPr>
+      <w:bookmarkStart w:id="20" w:name="ssd-cu01---iniciar-sesión"/>
+      <w:r>
+        <w:t>SSD-CU01 - Iniciar Sesión</w:t>
       </w:r>
     </w:p>
     <w:p>
@@ -1123,22 +1223,27 @@
         <w:pStyle w:val="CaptionedFigure"/>
       </w:pPr>
       <w:r>
+        <w:rPr>
+          <w:noProof/>
+        </w:rPr>
+        <w:lastRenderedPageBreak/>
         <w:drawing>
-          <wp:inline>
+          <wp:inline distT="0" distB="0" distL="0" distR="0" wp14:anchorId="37C9B421" wp14:editId="50102423">
             <wp:extent cx="5334000" cy="10575234"/>
-            <wp:effectExtent b="0" l="0" r="0" t="0"/>
-            <wp:docPr descr="SSD-CU01 - Iniciar Sesión" title="" id="76" name="Picture"/>
-            <a:graphic>
+            <wp:effectExtent l="0" t="0" r="0" b="0"/>
+            <wp:docPr id="76" name="Picture" descr="SSD-CU01 - Iniciar Sesión"/>
+            <wp:cNvGraphicFramePr/>
+            <a:graphic xmlns:a="http://schemas.openxmlformats.org/drawingml/2006/main">
               <a:graphicData uri="http://schemas.openxmlformats.org/drawingml/2006/picture">
-                <pic:pic>
+                <pic:pic xmlns:pic="http://schemas.openxmlformats.org/drawingml/2006/picture">
                   <pic:nvPicPr>
-                    <pic:cNvPr descr="images/SSD-CU01.png" id="77" name="Picture"/>
+                    <pic:cNvPr id="77" name="Picture" descr="images/SSD-CU01.png"/>
                     <pic:cNvPicPr>
-                      <a:picLocks noChangeArrowheads="1" noChangeAspect="1"/>
+                      <a:picLocks noChangeAspect="1" noChangeArrowheads="1"/>
                     </pic:cNvPicPr>
                   </pic:nvPicPr>
                   <pic:blipFill>
-                    <a:blip r:embed="rId75"/>
+                    <a:blip r:embed="rId21"/>
                     <a:stretch>
                       <a:fillRect/>
                     </a:stretch>
@@ -1170,17 +1275,18 @@
         <w:pStyle w:val="ImageCaption"/>
       </w:pPr>
       <w:r>
-        <w:t xml:space="preserve">SSD-CU01 - Iniciar Sesión</w:t>
-      </w:r>
-    </w:p>
-    <w:bookmarkEnd w:id="78"/>
-    <w:bookmarkStart w:id="82" w:name="ssd-cu02---ver-dashboard"/>
-    <w:p>
-      <w:pPr>
-        <w:pStyle w:val="Heading3"/>
-      </w:pPr>
-      <w:r>
-        <w:t xml:space="preserve">SSD-CU02 - Ver Dashboard</w:t>
+        <w:lastRenderedPageBreak/>
+        <w:t>SSD-CU01 - Iniciar Sesión</w:t>
+      </w:r>
+    </w:p>
+    <w:p>
+      <w:pPr>
+        <w:pStyle w:val="Ttulo3"/>
+      </w:pPr>
+      <w:bookmarkStart w:id="21" w:name="ssd-cu02---ver-dashboard"/>
+      <w:bookmarkEnd w:id="20"/>
+      <w:r>
+        <w:t>SSD-CU02 - Ver Dashboard</w:t>
       </w:r>
     </w:p>
     <w:p>
@@ -1188,22 +1294,26 @@
         <w:pStyle w:val="CaptionedFigure"/>
       </w:pPr>
       <w:r>
+        <w:rPr>
+          <w:noProof/>
+        </w:rPr>
         <w:drawing>
-          <wp:inline>
+          <wp:inline distT="0" distB="0" distL="0" distR="0" wp14:anchorId="16473DDD" wp14:editId="461D1762">
             <wp:extent cx="5334000" cy="4527781"/>
-            <wp:effectExtent b="0" l="0" r="0" t="0"/>
-            <wp:docPr descr="SSD-CU02 - Ver Dashboard" title="" id="80" name="Picture"/>
-            <a:graphic>
+            <wp:effectExtent l="0" t="0" r="0" b="0"/>
+            <wp:docPr id="80" name="Picture" descr="SSD-CU02 - Ver Dashboard"/>
+            <wp:cNvGraphicFramePr/>
+            <a:graphic xmlns:a="http://schemas.openxmlformats.org/drawingml/2006/main">
               <a:graphicData uri="http://schemas.openxmlformats.org/drawingml/2006/picture">
-                <pic:pic>
+                <pic:pic xmlns:pic="http://schemas.openxmlformats.org/drawingml/2006/picture">
                   <pic:nvPicPr>
-                    <pic:cNvPr descr="images/SSD-CU02.png" id="81" name="Picture"/>
+                    <pic:cNvPr id="81" name="Picture" descr="images/SSD-CU02.png"/>
                     <pic:cNvPicPr>
-                      <a:picLocks noChangeArrowheads="1" noChangeAspect="1"/>
+                      <a:picLocks noChangeAspect="1" noChangeArrowheads="1"/>
                     </pic:cNvPicPr>
                   </pic:nvPicPr>
                   <pic:blipFill>
-                    <a:blip r:embed="rId79"/>
+                    <a:blip r:embed="rId22"/>
                     <a:stretch>
                       <a:fillRect/>
                     </a:stretch>
@@ -1235,17 +1345,18 @@
         <w:pStyle w:val="ImageCaption"/>
       </w:pPr>
       <w:r>
-        <w:t xml:space="preserve">SSD-CU02 - Ver Dashboard</w:t>
-      </w:r>
-    </w:p>
-    <w:bookmarkEnd w:id="82"/>
-    <w:bookmarkStart w:id="86" w:name="ssd-cu03---crear-expediente"/>
-    <w:p>
-      <w:pPr>
-        <w:pStyle w:val="Heading3"/>
-      </w:pPr>
-      <w:r>
-        <w:t xml:space="preserve">SSD-CU03 - Crear Expediente</w:t>
+        <w:t>SSD-CU02 - Ver Dashboard</w:t>
+      </w:r>
+    </w:p>
+    <w:p>
+      <w:pPr>
+        <w:pStyle w:val="Ttulo3"/>
+      </w:pPr>
+      <w:bookmarkStart w:id="22" w:name="ssd-cu03---crear-expediente"/>
+      <w:bookmarkEnd w:id="21"/>
+      <w:r>
+        <w:lastRenderedPageBreak/>
+        <w:t>SSD-CU03 - Crear Expediente</w:t>
       </w:r>
     </w:p>
     <w:p>
@@ -1253,22 +1364,26 @@
         <w:pStyle w:val="CaptionedFigure"/>
       </w:pPr>
       <w:r>
+        <w:rPr>
+          <w:noProof/>
+        </w:rPr>
         <w:drawing>
-          <wp:inline>
+          <wp:inline distT="0" distB="0" distL="0" distR="0" wp14:anchorId="6516EB1B" wp14:editId="3B466937">
             <wp:extent cx="5334000" cy="7049584"/>
-            <wp:effectExtent b="0" l="0" r="0" t="0"/>
-            <wp:docPr descr="SSD-CU03 - Crear Expediente" title="" id="84" name="Picture"/>
-            <a:graphic>
+            <wp:effectExtent l="0" t="0" r="0" b="0"/>
+            <wp:docPr id="84" name="Picture" descr="SSD-CU03 - Crear Expediente"/>
+            <wp:cNvGraphicFramePr/>
+            <a:graphic xmlns:a="http://schemas.openxmlformats.org/drawingml/2006/main">
               <a:graphicData uri="http://schemas.openxmlformats.org/drawingml/2006/picture">
-                <pic:pic>
+                <pic:pic xmlns:pic="http://schemas.openxmlformats.org/drawingml/2006/picture">
                   <pic:nvPicPr>
-                    <pic:cNvPr descr="images/SSD-CU03.png" id="85" name="Picture"/>
+                    <pic:cNvPr id="85" name="Picture" descr="images/SSD-CU03.png"/>
                     <pic:cNvPicPr>
-                      <a:picLocks noChangeArrowheads="1" noChangeAspect="1"/>
+                      <a:picLocks noChangeAspect="1" noChangeArrowheads="1"/>
                     </pic:cNvPicPr>
                   </pic:nvPicPr>
                   <pic:blipFill>
-                    <a:blip r:embed="rId83"/>
+                    <a:blip r:embed="rId23"/>
                     <a:stretch>
                       <a:fillRect/>
                     </a:stretch>
@@ -1300,17 +1415,18 @@
         <w:pStyle w:val="ImageCaption"/>
       </w:pPr>
       <w:r>
-        <w:t xml:space="preserve">SSD-CU03 - Crear Expediente</w:t>
-      </w:r>
-    </w:p>
-    <w:bookmarkEnd w:id="86"/>
-    <w:bookmarkStart w:id="90" w:name="ssd-cu04---cambiar-estado-expediente"/>
-    <w:p>
-      <w:pPr>
-        <w:pStyle w:val="Heading3"/>
-      </w:pPr>
-      <w:r>
-        <w:t xml:space="preserve">SSD-CU04 - Cambiar Estado Expediente</w:t>
+        <w:t>SSD-CU03 - Crear Expediente</w:t>
+      </w:r>
+    </w:p>
+    <w:p>
+      <w:pPr>
+        <w:pStyle w:val="Ttulo3"/>
+      </w:pPr>
+      <w:bookmarkStart w:id="23" w:name="ssd-cu04---cambiar-estado-expediente"/>
+      <w:bookmarkEnd w:id="22"/>
+      <w:r>
+        <w:lastRenderedPageBreak/>
+        <w:t>SSD-CU04 - Cambiar Estado Expediente</w:t>
       </w:r>
     </w:p>
     <w:p>
@@ -1318,22 +1434,27 @@
         <w:pStyle w:val="CaptionedFigure"/>
       </w:pPr>
       <w:r>
+        <w:rPr>
+          <w:noProof/>
+        </w:rPr>
+        <w:lastRenderedPageBreak/>
         <w:drawing>
-          <wp:inline>
+          <wp:inline distT="0" distB="0" distL="0" distR="0" wp14:anchorId="173F26DE" wp14:editId="6CC2DBDA">
             <wp:extent cx="5334000" cy="13727708"/>
-            <wp:effectExtent b="0" l="0" r="0" t="0"/>
-            <wp:docPr descr="SSD-CU04 - Cambiar Estado Expediente" title="" id="88" name="Picture"/>
-            <a:graphic>
+            <wp:effectExtent l="0" t="0" r="0" b="0"/>
+            <wp:docPr id="88" name="Picture" descr="SSD-CU04 - Cambiar Estado Expediente"/>
+            <wp:cNvGraphicFramePr/>
+            <a:graphic xmlns:a="http://schemas.openxmlformats.org/drawingml/2006/main">
               <a:graphicData uri="http://schemas.openxmlformats.org/drawingml/2006/picture">
-                <pic:pic>
+                <pic:pic xmlns:pic="http://schemas.openxmlformats.org/drawingml/2006/picture">
                   <pic:nvPicPr>
-                    <pic:cNvPr descr="images/SSD-CU04.png" id="89" name="Picture"/>
+                    <pic:cNvPr id="89" name="Picture" descr="images/SSD-CU04.png"/>
                     <pic:cNvPicPr>
-                      <a:picLocks noChangeArrowheads="1" noChangeAspect="1"/>
+                      <a:picLocks noChangeAspect="1" noChangeArrowheads="1"/>
                     </pic:cNvPicPr>
                   </pic:nvPicPr>
                   <pic:blipFill>
-                    <a:blip r:embed="rId87"/>
+                    <a:blip r:embed="rId24"/>
                     <a:stretch>
                       <a:fillRect/>
                     </a:stretch>
@@ -1365,17 +1486,19 @@
         <w:pStyle w:val="ImageCaption"/>
       </w:pPr>
       <w:r>
-        <w:t xml:space="preserve">SSD-CU04 - Cambiar Estado Expediente</w:t>
-      </w:r>
-    </w:p>
-    <w:bookmarkEnd w:id="90"/>
-    <w:bookmarkStart w:id="94" w:name="ssd-cu05---adjuntar-documento"/>
-    <w:p>
-      <w:pPr>
-        <w:pStyle w:val="Heading3"/>
-      </w:pPr>
-      <w:r>
-        <w:t xml:space="preserve">SSD-CU05 - Adjuntar Documento</w:t>
+        <w:lastRenderedPageBreak/>
+        <w:t>SSD-CU04 - Cambiar Estado Expediente</w:t>
+      </w:r>
+    </w:p>
+    <w:p>
+      <w:pPr>
+        <w:pStyle w:val="Ttulo3"/>
+      </w:pPr>
+      <w:bookmarkStart w:id="24" w:name="ssd-cu05---adjuntar-documento"/>
+      <w:bookmarkEnd w:id="23"/>
+      <w:r>
+        <w:lastRenderedPageBreak/>
+        <w:t>SSD-CU05 - Adjuntar Documento</w:t>
       </w:r>
     </w:p>
     <w:p>
@@ -1383,22 +1506,26 @@
         <w:pStyle w:val="CaptionedFigure"/>
       </w:pPr>
       <w:r>
+        <w:rPr>
+          <w:noProof/>
+        </w:rPr>
         <w:drawing>
-          <wp:inline>
+          <wp:inline distT="0" distB="0" distL="0" distR="0" wp14:anchorId="0A7925CC" wp14:editId="64ABB04A">
             <wp:extent cx="5334000" cy="7711807"/>
-            <wp:effectExtent b="0" l="0" r="0" t="0"/>
-            <wp:docPr descr="SSD-CU05 - Adjuntar Documento" title="" id="92" name="Picture"/>
-            <a:graphic>
+            <wp:effectExtent l="0" t="0" r="0" b="0"/>
+            <wp:docPr id="92" name="Picture" descr="SSD-CU05 - Adjuntar Documento"/>
+            <wp:cNvGraphicFramePr/>
+            <a:graphic xmlns:a="http://schemas.openxmlformats.org/drawingml/2006/main">
               <a:graphicData uri="http://schemas.openxmlformats.org/drawingml/2006/picture">
-                <pic:pic>
+                <pic:pic xmlns:pic="http://schemas.openxmlformats.org/drawingml/2006/picture">
                   <pic:nvPicPr>
-                    <pic:cNvPr descr="images/SSD-CU05.png" id="93" name="Picture"/>
+                    <pic:cNvPr id="93" name="Picture" descr="images/SSD-CU05.png"/>
                     <pic:cNvPicPr>
-                      <a:picLocks noChangeArrowheads="1" noChangeAspect="1"/>
+                      <a:picLocks noChangeAspect="1" noChangeArrowheads="1"/>
                     </pic:cNvPicPr>
                   </pic:nvPicPr>
                   <pic:blipFill>
-                    <a:blip r:embed="rId91"/>
+                    <a:blip r:embed="rId25"/>
                     <a:stretch>
                       <a:fillRect/>
                     </a:stretch>
@@ -1430,17 +1557,19 @@
         <w:pStyle w:val="ImageCaption"/>
       </w:pPr>
       <w:r>
-        <w:t xml:space="preserve">SSD-CU05 - Adjuntar Documento</w:t>
-      </w:r>
-    </w:p>
-    <w:bookmarkEnd w:id="94"/>
-    <w:bookmarkStart w:id="98" w:name="ssd-cu06---gestionar-techo-presupuestal"/>
-    <w:p>
-      <w:pPr>
-        <w:pStyle w:val="Heading3"/>
-      </w:pPr>
-      <w:r>
-        <w:t xml:space="preserve">SSD-CU06 - Gestionar Techo Presupuestal</w:t>
+        <w:lastRenderedPageBreak/>
+        <w:t>SSD-CU05 - Adjuntar Documento</w:t>
+      </w:r>
+    </w:p>
+    <w:p>
+      <w:pPr>
+        <w:pStyle w:val="Ttulo3"/>
+      </w:pPr>
+      <w:bookmarkStart w:id="25" w:name="ssd-cu06---gestionar-techo-presupuestal"/>
+      <w:bookmarkEnd w:id="24"/>
+      <w:r>
+        <w:lastRenderedPageBreak/>
+        <w:t>SSD-CU06 - Gestionar Techo Presupuestal</w:t>
       </w:r>
     </w:p>
     <w:p>
@@ -1448,22 +1577,27 @@
         <w:pStyle w:val="CaptionedFigure"/>
       </w:pPr>
       <w:r>
+        <w:rPr>
+          <w:noProof/>
+        </w:rPr>
+        <w:lastRenderedPageBreak/>
         <w:drawing>
-          <wp:inline>
+          <wp:inline distT="0" distB="0" distL="0" distR="0" wp14:anchorId="2996F507" wp14:editId="1F42E7D5">
             <wp:extent cx="5334000" cy="8334375"/>
-            <wp:effectExtent b="0" l="0" r="0" t="0"/>
-            <wp:docPr descr="SSD-CU06 - Gestionar Techo Presupuestal" title="" id="96" name="Picture"/>
-            <a:graphic>
+            <wp:effectExtent l="0" t="0" r="0" b="0"/>
+            <wp:docPr id="96" name="Picture" descr="SSD-CU06 - Gestionar Techo Presupuestal"/>
+            <wp:cNvGraphicFramePr/>
+            <a:graphic xmlns:a="http://schemas.openxmlformats.org/drawingml/2006/main">
               <a:graphicData uri="http://schemas.openxmlformats.org/drawingml/2006/picture">
-                <pic:pic>
+                <pic:pic xmlns:pic="http://schemas.openxmlformats.org/drawingml/2006/picture">
                   <pic:nvPicPr>
-                    <pic:cNvPr descr="images/SSD-CU06.png" id="97" name="Picture"/>
+                    <pic:cNvPr id="97" name="Picture" descr="images/SSD-CU06.png"/>
                     <pic:cNvPicPr>
-                      <a:picLocks noChangeArrowheads="1" noChangeAspect="1"/>
+                      <a:picLocks noChangeAspect="1" noChangeArrowheads="1"/>
                     </pic:cNvPicPr>
                   </pic:nvPicPr>
                   <pic:blipFill>
-                    <a:blip r:embed="rId95"/>
+                    <a:blip r:embed="rId26"/>
                     <a:stretch>
                       <a:fillRect/>
                     </a:stretch>
@@ -1495,17 +1629,18 @@
         <w:pStyle w:val="ImageCaption"/>
       </w:pPr>
       <w:r>
-        <w:t xml:space="preserve">SSD-CU06 - Gestionar Techo Presupuestal</w:t>
-      </w:r>
-    </w:p>
-    <w:bookmarkEnd w:id="98"/>
-    <w:bookmarkStart w:id="102" w:name="ssd-cu07---gestionar-actividad-poi"/>
-    <w:p>
-      <w:pPr>
-        <w:pStyle w:val="Heading3"/>
-      </w:pPr>
-      <w:r>
-        <w:t xml:space="preserve">SSD-CU07 - Gestionar Actividad POI</w:t>
+        <w:lastRenderedPageBreak/>
+        <w:t>SSD-CU06 - Gestionar Techo Presupuestal</w:t>
+      </w:r>
+    </w:p>
+    <w:p>
+      <w:pPr>
+        <w:pStyle w:val="Ttulo3"/>
+      </w:pPr>
+      <w:bookmarkStart w:id="26" w:name="ssd-cu07---gestionar-actividad-poi"/>
+      <w:bookmarkEnd w:id="25"/>
+      <w:r>
+        <w:t>SSD-CU07 - Gestionar Actividad POI</w:t>
       </w:r>
     </w:p>
     <w:p>
@@ -1513,22 +1648,26 @@
         <w:pStyle w:val="CaptionedFigure"/>
       </w:pPr>
       <w:r>
+        <w:rPr>
+          <w:noProof/>
+        </w:rPr>
         <w:drawing>
-          <wp:inline>
+          <wp:inline distT="0" distB="0" distL="0" distR="0" wp14:anchorId="64C4AB7F" wp14:editId="67F40E29">
             <wp:extent cx="5334000" cy="6833419"/>
-            <wp:effectExtent b="0" l="0" r="0" t="0"/>
-            <wp:docPr descr="SSD-CU07 - Gestionar Actividad POI" title="" id="100" name="Picture"/>
-            <a:graphic>
+            <wp:effectExtent l="0" t="0" r="0" b="0"/>
+            <wp:docPr id="100" name="Picture" descr="SSD-CU07 - Gestionar Actividad POI"/>
+            <wp:cNvGraphicFramePr/>
+            <a:graphic xmlns:a="http://schemas.openxmlformats.org/drawingml/2006/main">
               <a:graphicData uri="http://schemas.openxmlformats.org/drawingml/2006/picture">
-                <pic:pic>
+                <pic:pic xmlns:pic="http://schemas.openxmlformats.org/drawingml/2006/picture">
                   <pic:nvPicPr>
-                    <pic:cNvPr descr="images/SSD-CU07.png" id="101" name="Picture"/>
+                    <pic:cNvPr id="101" name="Picture" descr="images/SSD-CU07.png"/>
                     <pic:cNvPicPr>
-                      <a:picLocks noChangeArrowheads="1" noChangeAspect="1"/>
+                      <a:picLocks noChangeAspect="1" noChangeArrowheads="1"/>
                     </pic:cNvPicPr>
                   </pic:nvPicPr>
                   <pic:blipFill>
-                    <a:blip r:embed="rId99"/>
+                    <a:blip r:embed="rId27"/>
                     <a:stretch>
                       <a:fillRect/>
                     </a:stretch>
@@ -1560,17 +1699,18 @@
         <w:pStyle w:val="ImageCaption"/>
       </w:pPr>
       <w:r>
-        <w:t xml:space="preserve">SSD-CU07 - Gestionar Actividad POI</w:t>
-      </w:r>
-    </w:p>
-    <w:bookmarkEnd w:id="102"/>
-    <w:bookmarkStart w:id="106" w:name="ssd-cu08---gestionar-necesidad-pap"/>
-    <w:p>
-      <w:pPr>
-        <w:pStyle w:val="Heading3"/>
-      </w:pPr>
-      <w:r>
-        <w:t xml:space="preserve">SSD-CU08 - Gestionar Necesidad PAP</w:t>
+        <w:t>SSD-CU07 - Gestionar Actividad POI</w:t>
+      </w:r>
+    </w:p>
+    <w:p>
+      <w:pPr>
+        <w:pStyle w:val="Ttulo3"/>
+      </w:pPr>
+      <w:bookmarkStart w:id="27" w:name="ssd-cu08---gestionar-necesidad-pap"/>
+      <w:bookmarkEnd w:id="26"/>
+      <w:r>
+        <w:lastRenderedPageBreak/>
+        <w:t>SSD-CU08 - Gestionar Necesidad PAP</w:t>
       </w:r>
     </w:p>
     <w:p>
@@ -1578,22 +1718,26 @@
         <w:pStyle w:val="CaptionedFigure"/>
       </w:pPr>
       <w:r>
+        <w:rPr>
+          <w:noProof/>
+        </w:rPr>
         <w:drawing>
-          <wp:inline>
+          <wp:inline distT="0" distB="0" distL="0" distR="0" wp14:anchorId="18D031BC" wp14:editId="0610AFEC">
             <wp:extent cx="5334000" cy="5378123"/>
-            <wp:effectExtent b="0" l="0" r="0" t="0"/>
-            <wp:docPr descr="SSD-CU08 - Gestionar Necesidad PAP" title="" id="104" name="Picture"/>
-            <a:graphic>
+            <wp:effectExtent l="0" t="0" r="0" b="0"/>
+            <wp:docPr id="104" name="Picture" descr="SSD-CU08 - Gestionar Necesidad PAP"/>
+            <wp:cNvGraphicFramePr/>
+            <a:graphic xmlns:a="http://schemas.openxmlformats.org/drawingml/2006/main">
               <a:graphicData uri="http://schemas.openxmlformats.org/drawingml/2006/picture">
-                <pic:pic>
+                <pic:pic xmlns:pic="http://schemas.openxmlformats.org/drawingml/2006/picture">
                   <pic:nvPicPr>
-                    <pic:cNvPr descr="images/SSD-CU08.png" id="105" name="Picture"/>
+                    <pic:cNvPr id="105" name="Picture" descr="images/SSD-CU08.png"/>
                     <pic:cNvPicPr>
-                      <a:picLocks noChangeArrowheads="1" noChangeAspect="1"/>
+                      <a:picLocks noChangeAspect="1" noChangeArrowheads="1"/>
                     </pic:cNvPicPr>
                   </pic:nvPicPr>
                   <pic:blipFill>
-                    <a:blip r:embed="rId103"/>
+                    <a:blip r:embed="rId28"/>
                     <a:stretch>
                       <a:fillRect/>
                     </a:stretch>
@@ -1625,17 +1769,18 @@
         <w:pStyle w:val="ImageCaption"/>
       </w:pPr>
       <w:r>
-        <w:t xml:space="preserve">SSD-CU08 - Gestionar Necesidad PAP</w:t>
-      </w:r>
-    </w:p>
-    <w:bookmarkEnd w:id="106"/>
-    <w:bookmarkStart w:id="110" w:name="ssd-cu09---gestionar-nota-modificatoria"/>
-    <w:p>
-      <w:pPr>
-        <w:pStyle w:val="Heading3"/>
-      </w:pPr>
-      <w:r>
-        <w:t xml:space="preserve">SSD-CU09 - Gestionar Nota Modificatoria</w:t>
+        <w:t>SSD-CU08 - Gestionar Necesidad PAP</w:t>
+      </w:r>
+    </w:p>
+    <w:p>
+      <w:pPr>
+        <w:pStyle w:val="Ttulo3"/>
+      </w:pPr>
+      <w:bookmarkStart w:id="28" w:name="ssd-cu09---gestionar-nota-modificatoria"/>
+      <w:bookmarkEnd w:id="27"/>
+      <w:r>
+        <w:lastRenderedPageBreak/>
+        <w:t>SSD-CU09 - Gestionar Nota Modificatoria</w:t>
       </w:r>
     </w:p>
     <w:p>
@@ -1643,22 +1788,27 @@
         <w:pStyle w:val="CaptionedFigure"/>
       </w:pPr>
       <w:r>
+        <w:rPr>
+          <w:noProof/>
+        </w:rPr>
+        <w:lastRenderedPageBreak/>
         <w:drawing>
-          <wp:inline>
+          <wp:inline distT="0" distB="0" distL="0" distR="0" wp14:anchorId="4939B42B" wp14:editId="45C1C1BE">
             <wp:extent cx="5334000" cy="8001000"/>
-            <wp:effectExtent b="0" l="0" r="0" t="0"/>
-            <wp:docPr descr="SSD-CU09 - Gestionar Nota Modificatoria" title="" id="108" name="Picture"/>
-            <a:graphic>
+            <wp:effectExtent l="0" t="0" r="0" b="0"/>
+            <wp:docPr id="108" name="Picture" descr="SSD-CU09 - Gestionar Nota Modificatoria"/>
+            <wp:cNvGraphicFramePr/>
+            <a:graphic xmlns:a="http://schemas.openxmlformats.org/drawingml/2006/main">
               <a:graphicData uri="http://schemas.openxmlformats.org/drawingml/2006/picture">
-                <pic:pic>
+                <pic:pic xmlns:pic="http://schemas.openxmlformats.org/drawingml/2006/picture">
                   <pic:nvPicPr>
-                    <pic:cNvPr descr="images/SSD-CU09.png" id="109" name="Picture"/>
+                    <pic:cNvPr id="109" name="Picture" descr="images/SSD-CU09.png"/>
                     <pic:cNvPicPr>
-                      <a:picLocks noChangeArrowheads="1" noChangeAspect="1"/>
+                      <a:picLocks noChangeAspect="1" noChangeArrowheads="1"/>
                     </pic:cNvPicPr>
                   </pic:nvPicPr>
                   <pic:blipFill>
-                    <a:blip r:embed="rId107"/>
+                    <a:blip r:embed="rId29"/>
                     <a:stretch>
                       <a:fillRect/>
                     </a:stretch>
@@ -1690,17 +1840,19 @@
         <w:pStyle w:val="ImageCaption"/>
       </w:pPr>
       <w:r>
-        <w:t xml:space="preserve">SSD-CU09 - Gestionar Nota Modificatoria</w:t>
-      </w:r>
-    </w:p>
-    <w:bookmarkEnd w:id="110"/>
-    <w:bookmarkStart w:id="114" w:name="ssd-cu10---ver-reportes"/>
-    <w:p>
-      <w:pPr>
-        <w:pStyle w:val="Heading3"/>
-      </w:pPr>
-      <w:r>
-        <w:t xml:space="preserve">SSD-CU10 - Ver Reportes</w:t>
+        <w:lastRenderedPageBreak/>
+        <w:t>SSD-CU09 - Gestionar Nota Modificatoria</w:t>
+      </w:r>
+    </w:p>
+    <w:p>
+      <w:pPr>
+        <w:pStyle w:val="Ttulo3"/>
+      </w:pPr>
+      <w:bookmarkStart w:id="29" w:name="ssd-cu10---ver-reportes"/>
+      <w:bookmarkEnd w:id="28"/>
+      <w:r>
+        <w:lastRenderedPageBreak/>
+        <w:t>SSD-CU10 - Ver Reportes</w:t>
       </w:r>
     </w:p>
     <w:p>
@@ -1708,22 +1860,27 @@
         <w:pStyle w:val="CaptionedFigure"/>
       </w:pPr>
       <w:r>
+        <w:rPr>
+          <w:noProof/>
+        </w:rPr>
+        <w:lastRenderedPageBreak/>
         <w:drawing>
-          <wp:inline>
+          <wp:inline distT="0" distB="0" distL="0" distR="0" wp14:anchorId="353273FC" wp14:editId="6B985BD7">
             <wp:extent cx="5334000" cy="8365386"/>
-            <wp:effectExtent b="0" l="0" r="0" t="0"/>
-            <wp:docPr descr="SSD-CU10 - Ver Reportes" title="" id="112" name="Picture"/>
-            <a:graphic>
+            <wp:effectExtent l="0" t="0" r="0" b="0"/>
+            <wp:docPr id="112" name="Picture" descr="SSD-CU10 - Ver Reportes"/>
+            <wp:cNvGraphicFramePr/>
+            <a:graphic xmlns:a="http://schemas.openxmlformats.org/drawingml/2006/main">
               <a:graphicData uri="http://schemas.openxmlformats.org/drawingml/2006/picture">
-                <pic:pic>
+                <pic:pic xmlns:pic="http://schemas.openxmlformats.org/drawingml/2006/picture">
                   <pic:nvPicPr>
-                    <pic:cNvPr descr="images/SSD-CU10.png" id="113" name="Picture"/>
+                    <pic:cNvPr id="113" name="Picture" descr="images/SSD-CU10.png"/>
                     <pic:cNvPicPr>
-                      <a:picLocks noChangeArrowheads="1" noChangeAspect="1"/>
+                      <a:picLocks noChangeAspect="1" noChangeArrowheads="1"/>
                     </pic:cNvPicPr>
                   </pic:nvPicPr>
                   <pic:blipFill>
-                    <a:blip r:embed="rId111"/>
+                    <a:blip r:embed="rId30"/>
                     <a:stretch>
                       <a:fillRect/>
                     </a:stretch>
@@ -1755,17 +1912,18 @@
         <w:pStyle w:val="ImageCaption"/>
       </w:pPr>
       <w:r>
-        <w:t xml:space="preserve">SSD-CU10 - Ver Reportes</w:t>
-      </w:r>
-    </w:p>
-    <w:bookmarkEnd w:id="114"/>
-    <w:bookmarkStart w:id="118" w:name="ssd-cu11---gestionar-usuarios"/>
-    <w:p>
-      <w:pPr>
-        <w:pStyle w:val="Heading3"/>
-      </w:pPr>
-      <w:r>
-        <w:t xml:space="preserve">SSD-CU11 - Gestionar Usuarios</w:t>
+        <w:lastRenderedPageBreak/>
+        <w:t>SSD-CU10 - Ver Reportes</w:t>
+      </w:r>
+    </w:p>
+    <w:p>
+      <w:pPr>
+        <w:pStyle w:val="Ttulo3"/>
+      </w:pPr>
+      <w:bookmarkStart w:id="30" w:name="ssd-cu11---gestionar-usuarios"/>
+      <w:bookmarkEnd w:id="29"/>
+      <w:r>
+        <w:t>SSD-CU11 - Gestionar Usuarios</w:t>
       </w:r>
     </w:p>
     <w:p>
@@ -1773,22 +1931,26 @@
         <w:pStyle w:val="CaptionedFigure"/>
       </w:pPr>
       <w:r>
+        <w:rPr>
+          <w:noProof/>
+        </w:rPr>
         <w:drawing>
-          <wp:inline>
+          <wp:inline distT="0" distB="0" distL="0" distR="0" wp14:anchorId="4F084A61" wp14:editId="0C1A4E12">
             <wp:extent cx="5334000" cy="7357024"/>
-            <wp:effectExtent b="0" l="0" r="0" t="0"/>
-            <wp:docPr descr="SSD-CU11 - Gestionar Usuarios" title="" id="116" name="Picture"/>
-            <a:graphic>
+            <wp:effectExtent l="0" t="0" r="0" b="0"/>
+            <wp:docPr id="116" name="Picture" descr="SSD-CU11 - Gestionar Usuarios"/>
+            <wp:cNvGraphicFramePr/>
+            <a:graphic xmlns:a="http://schemas.openxmlformats.org/drawingml/2006/main">
               <a:graphicData uri="http://schemas.openxmlformats.org/drawingml/2006/picture">
-                <pic:pic>
+                <pic:pic xmlns:pic="http://schemas.openxmlformats.org/drawingml/2006/picture">
                   <pic:nvPicPr>
-                    <pic:cNvPr descr="images/SSD-CU11.png" id="117" name="Picture"/>
+                    <pic:cNvPr id="117" name="Picture" descr="images/SSD-CU11.png"/>
                     <pic:cNvPicPr>
-                      <a:picLocks noChangeArrowheads="1" noChangeAspect="1"/>
+                      <a:picLocks noChangeAspect="1" noChangeArrowheads="1"/>
                     </pic:cNvPicPr>
                   </pic:nvPicPr>
                   <pic:blipFill>
-                    <a:blip r:embed="rId115"/>
+                    <a:blip r:embed="rId31"/>
                     <a:stretch>
                       <a:fillRect/>
                     </a:stretch>
@@ -1820,17 +1982,18 @@
         <w:pStyle w:val="ImageCaption"/>
       </w:pPr>
       <w:r>
-        <w:t xml:space="preserve">SSD-CU11 - Gestionar Usuarios</w:t>
-      </w:r>
-    </w:p>
-    <w:bookmarkEnd w:id="118"/>
-    <w:bookmarkStart w:id="122" w:name="ssd-cu12---gestionar-notificaciones"/>
-    <w:p>
-      <w:pPr>
-        <w:pStyle w:val="Heading3"/>
-      </w:pPr>
-      <w:r>
-        <w:t xml:space="preserve">SSD-CU12 - Gestionar Notificaciones</w:t>
+        <w:t>SSD-CU11 - Gestionar Usuarios</w:t>
+      </w:r>
+    </w:p>
+    <w:p>
+      <w:pPr>
+        <w:pStyle w:val="Ttulo3"/>
+      </w:pPr>
+      <w:bookmarkStart w:id="31" w:name="ssd-cu12---gestionar-notificaciones"/>
+      <w:bookmarkEnd w:id="30"/>
+      <w:r>
+        <w:lastRenderedPageBreak/>
+        <w:t>SSD-CU12 - Gestionar Notificaciones</w:t>
       </w:r>
     </w:p>
     <w:p>
@@ -1838,22 +2001,26 @@
         <w:pStyle w:val="CaptionedFigure"/>
       </w:pPr>
       <w:r>
+        <w:rPr>
+          <w:noProof/>
+        </w:rPr>
         <w:drawing>
-          <wp:inline>
+          <wp:inline distT="0" distB="0" distL="0" distR="0" wp14:anchorId="6831D26B" wp14:editId="5A623075">
             <wp:extent cx="5334000" cy="6457338"/>
-            <wp:effectExtent b="0" l="0" r="0" t="0"/>
-            <wp:docPr descr="SSD-CU12 - Gestionar Notificaciones" title="" id="120" name="Picture"/>
-            <a:graphic>
+            <wp:effectExtent l="0" t="0" r="0" b="0"/>
+            <wp:docPr id="120" name="Picture" descr="SSD-CU12 - Gestionar Notificaciones"/>
+            <wp:cNvGraphicFramePr/>
+            <a:graphic xmlns:a="http://schemas.openxmlformats.org/drawingml/2006/main">
               <a:graphicData uri="http://schemas.openxmlformats.org/drawingml/2006/picture">
-                <pic:pic>
+                <pic:pic xmlns:pic="http://schemas.openxmlformats.org/drawingml/2006/picture">
                   <pic:nvPicPr>
-                    <pic:cNvPr descr="images/SSD-CU12.png" id="121" name="Picture"/>
+                    <pic:cNvPr id="121" name="Picture" descr="images/SSD-CU12.png"/>
                     <pic:cNvPicPr>
-                      <a:picLocks noChangeArrowheads="1" noChangeAspect="1"/>
+                      <a:picLocks noChangeAspect="1" noChangeArrowheads="1"/>
                     </pic:cNvPicPr>
                   </pic:nvPicPr>
                   <pic:blipFill>
-                    <a:blip r:embed="rId119"/>
+                    <a:blip r:embed="rId32"/>
                     <a:stretch>
                       <a:fillRect/>
                     </a:stretch>
@@ -1885,17 +2052,18 @@
         <w:pStyle w:val="ImageCaption"/>
       </w:pPr>
       <w:r>
-        <w:t xml:space="preserve">SSD-CU12 - Gestionar Notificaciones</w:t>
-      </w:r>
-    </w:p>
-    <w:bookmarkEnd w:id="122"/>
-    <w:bookmarkStart w:id="126" w:name="ssd-cu13---rastrear-expediente-público"/>
-    <w:p>
-      <w:pPr>
-        <w:pStyle w:val="Heading3"/>
-      </w:pPr>
-      <w:r>
-        <w:t xml:space="preserve">SSD-CU13 - Rastrear Expediente (Público)</w:t>
+        <w:t>SSD-CU12 - Gestionar Notificaciones</w:t>
+      </w:r>
+    </w:p>
+    <w:p>
+      <w:pPr>
+        <w:pStyle w:val="Ttulo3"/>
+      </w:pPr>
+      <w:bookmarkStart w:id="32" w:name="ssd-cu13---rastrear-expediente-público"/>
+      <w:bookmarkEnd w:id="31"/>
+      <w:r>
+        <w:lastRenderedPageBreak/>
+        <w:t>SSD-CU13 - Rastrear Expediente (Público)</w:t>
       </w:r>
     </w:p>
     <w:p>
@@ -1903,22 +2071,26 @@
         <w:pStyle w:val="CaptionedFigure"/>
       </w:pPr>
       <w:r>
+        <w:rPr>
+          <w:noProof/>
+        </w:rPr>
         <w:drawing>
-          <wp:inline>
+          <wp:inline distT="0" distB="0" distL="0" distR="0" wp14:anchorId="03E9CD54" wp14:editId="3B76B44E">
             <wp:extent cx="5334000" cy="5188692"/>
-            <wp:effectExtent b="0" l="0" r="0" t="0"/>
-            <wp:docPr descr="SSD-CU13 - Rastrear Expediente (Público)" title="" id="124" name="Picture"/>
-            <a:graphic>
+            <wp:effectExtent l="0" t="0" r="0" b="0"/>
+            <wp:docPr id="124" name="Picture" descr="SSD-CU13 - Rastrear Expediente (Público)"/>
+            <wp:cNvGraphicFramePr/>
+            <a:graphic xmlns:a="http://schemas.openxmlformats.org/drawingml/2006/main">
               <a:graphicData uri="http://schemas.openxmlformats.org/drawingml/2006/picture">
-                <pic:pic>
+                <pic:pic xmlns:pic="http://schemas.openxmlformats.org/drawingml/2006/picture">
                   <pic:nvPicPr>
-                    <pic:cNvPr descr="images/SSD-CU13.png" id="125" name="Picture"/>
+                    <pic:cNvPr id="125" name="Picture" descr="images/SSD-CU13.png"/>
                     <pic:cNvPicPr>
-                      <a:picLocks noChangeArrowheads="1" noChangeAspect="1"/>
+                      <a:picLocks noChangeAspect="1" noChangeArrowheads="1"/>
                     </pic:cNvPicPr>
                   </pic:nvPicPr>
                   <pic:blipFill>
-                    <a:blip r:embed="rId123"/>
+                    <a:blip r:embed="rId33"/>
                     <a:stretch>
                       <a:fillRect/>
                     </a:stretch>
@@ -1950,17 +2122,18 @@
         <w:pStyle w:val="ImageCaption"/>
       </w:pPr>
       <w:r>
-        <w:t xml:space="preserve">SSD-CU13 - Rastrear Expediente (Público)</w:t>
-      </w:r>
-    </w:p>
-    <w:bookmarkEnd w:id="126"/>
-    <w:bookmarkStart w:id="130" w:name="ssd-cu14---cerrar-sesión"/>
-    <w:p>
-      <w:pPr>
-        <w:pStyle w:val="Heading3"/>
-      </w:pPr>
-      <w:r>
-        <w:t xml:space="preserve">SSD-CU14 - Cerrar Sesión</w:t>
+        <w:t>SSD-CU13 - Rastrear Expediente (Público)</w:t>
+      </w:r>
+    </w:p>
+    <w:p>
+      <w:pPr>
+        <w:pStyle w:val="Ttulo3"/>
+      </w:pPr>
+      <w:bookmarkStart w:id="33" w:name="ssd-cu14---cerrar-sesión"/>
+      <w:bookmarkEnd w:id="32"/>
+      <w:r>
+        <w:lastRenderedPageBreak/>
+        <w:t>SSD-CU14 - Cerrar Sesión</w:t>
       </w:r>
     </w:p>
     <w:p>
@@ -1968,22 +2141,26 @@
         <w:pStyle w:val="CaptionedFigure"/>
       </w:pPr>
       <w:r>
+        <w:rPr>
+          <w:noProof/>
+        </w:rPr>
         <w:drawing>
-          <wp:inline>
+          <wp:inline distT="0" distB="0" distL="0" distR="0" wp14:anchorId="53EFF54B" wp14:editId="37A219BC">
             <wp:extent cx="5334000" cy="5502546"/>
-            <wp:effectExtent b="0" l="0" r="0" t="0"/>
-            <wp:docPr descr="SSD-CU14 - Cerrar Sesión" title="" id="128" name="Picture"/>
-            <a:graphic>
+            <wp:effectExtent l="0" t="0" r="0" b="0"/>
+            <wp:docPr id="128" name="Picture" descr="SSD-CU14 - Cerrar Sesión"/>
+            <wp:cNvGraphicFramePr/>
+            <a:graphic xmlns:a="http://schemas.openxmlformats.org/drawingml/2006/main">
               <a:graphicData uri="http://schemas.openxmlformats.org/drawingml/2006/picture">
-                <pic:pic>
+                <pic:pic xmlns:pic="http://schemas.openxmlformats.org/drawingml/2006/picture">
                   <pic:nvPicPr>
-                    <pic:cNvPr descr="images/SSD-CU14.png" id="129" name="Picture"/>
+                    <pic:cNvPr id="129" name="Picture" descr="images/SSD-CU14.png"/>
                     <pic:cNvPicPr>
-                      <a:picLocks noChangeArrowheads="1" noChangeAspect="1"/>
+                      <a:picLocks noChangeAspect="1" noChangeArrowheads="1"/>
                     </pic:cNvPicPr>
                   </pic:nvPicPr>
                   <pic:blipFill>
-                    <a:blip r:embed="rId127"/>
+                    <a:blip r:embed="rId34"/>
                     <a:stretch>
                       <a:fillRect/>
                     </a:stretch>
@@ -2015,49 +2192,30 @@
         <w:pStyle w:val="ImageCaption"/>
       </w:pPr>
       <w:r>
-        <w:t xml:space="preserve">SSD-CU14 - Cerrar Sesión</w:t>
-      </w:r>
-    </w:p>
-    <w:bookmarkEnd w:id="130"/>
-    <w:bookmarkEnd w:id="131"/>
-    <w:bookmarkEnd w:id="132"/>
+        <w:t>SSD-CU14 - Cerrar Sesión</w:t>
+      </w:r>
+      <w:bookmarkEnd w:id="0"/>
+      <w:bookmarkEnd w:id="19"/>
+      <w:bookmarkEnd w:id="33"/>
+    </w:p>
     <w:sectPr>
       <w:footnotePr>
         <w:numRestart w:val="eachSect"/>
       </w:footnotePr>
+      <w:pgSz w:w="12240" w:h="15840"/>
+      <w:pgMar w:top="1417" w:right="1701" w:bottom="1417" w:left="1701" w:header="720" w:footer="720" w:gutter="0"/>
+      <w:cols w:space="720"/>
     </w:sectPr>
   </w:body>
 </w:document>
 </file>
 
-<file path=word/comments.xml><?xml version="1.0" encoding="utf-8"?>
-<w:comments xmlns:w="http://schemas.openxmlformats.org/wordprocessingml/2006/main" xmlns:m="http://schemas.openxmlformats.org/officeDocument/2006/math" xmlns:r="http://schemas.openxmlformats.org/officeDocument/2006/relationships" xmlns:o="urn:schemas-microsoft-com:office:office" xmlns:v="urn:schemas-microsoft-com:vml" xmlns:w10="urn:schemas-microsoft-com:office:word" xmlns:a="http://schemas.openxmlformats.org/drawingml/2006/main" xmlns:pic="http://schemas.openxmlformats.org/drawingml/2006/picture" xmlns:wp="http://schemas.openxmlformats.org/drawingml/2006/wordprocessingDrawing"/>
-</file>
-
-<file path=word/footnotes.xml><?xml version="1.0" encoding="utf-8"?>
-<w:footnotes xmlns:w="http://schemas.openxmlformats.org/wordprocessingml/2006/main" xmlns:m="http://schemas.openxmlformats.org/officeDocument/2006/math" xmlns:r="http://schemas.openxmlformats.org/officeDocument/2006/relationships" xmlns:o="urn:schemas-microsoft-com:office:office" xmlns:v="urn:schemas-microsoft-com:vml" xmlns:w10="urn:schemas-microsoft-com:office:word" xmlns:a="http://schemas.openxmlformats.org/drawingml/2006/main" xmlns:pic="http://schemas.openxmlformats.org/drawingml/2006/picture" xmlns:wp="http://schemas.openxmlformats.org/drawingml/2006/wordprocessingDrawing">
-  <w:footnote w:type="continuationSeparator" w:id="0">
-    <w:p>
-      <w:r>
-        <w:continuationSeparator/>
-      </w:r>
-    </w:p>
-  </w:footnote>
-  <w:footnote w:type="separator" w:id="-1">
-    <w:p>
-      <w:r>
-        <w:separator/>
-      </w:r>
-    </w:p>
-  </w:footnote>
-</w:footnotes>
-</file>
-
 <file path=word/numbering.xml><?xml version="1.0" encoding="utf-8"?>
-<w:numbering xmlns:w="http://schemas.openxmlformats.org/wordprocessingml/2006/main">
-  <w:abstractNum w:abstractNumId="990">
+<w:numbering xmlns:wpc="http://schemas.microsoft.com/office/word/2010/wordprocessingCanvas" xmlns:cx="http://schemas.microsoft.com/office/drawing/2014/chartex" xmlns:cx1="http://schemas.microsoft.com/office/drawing/2015/9/8/chartex" xmlns:cx2="http://schemas.microsoft.com/office/drawing/2015/10/21/chartex" xmlns:cx3="http://schemas.microsoft.com/office/drawing/2016/5/9/chartex" xmlns:cx4="http://schemas.microsoft.com/office/drawing/2016/5/10/chartex" xmlns:cx5="http://schemas.microsoft.com/office/drawing/2016/5/11/chartex" xmlns:cx6="http://schemas.microsoft.com/office/drawing/2016/5/12/chartex" xmlns:cx7="http://schemas.microsoft.com/office/drawing/2016/5/13/chartex" xmlns:cx8="http://schemas.microsoft.com/office/drawing/2016/5/14/chartex" xmlns:mc="http://schemas.openxmlformats.org/markup-compatibility/2006" xmlns:aink="http://schemas.microsoft.com/office/drawing/2016/ink" xmlns:am3d="http://schemas.microsoft.com/office/drawing/2017/model3d" xmlns:o="urn:schemas-microsoft-com:office:office" xmlns:oel="http://schemas.microsoft.com/office/2019/extlst" xmlns:r="http://schemas.openxmlformats.org/officeDocument/2006/relationships" xmlns:m="http://schemas.openxmlformats.org/officeDocument/2006/math" xmlns:v="urn:schemas-microsoft-com:vml" xmlns:wp14="http://schemas.microsoft.com/office/word/2010/wordprocessingDrawing" xmlns:wp="http://schemas.openxmlformats.org/drawingml/2006/wordprocessingDrawing" xmlns:w10="urn:schemas-microsoft-com:office:word" xmlns:w="http://schemas.openxmlformats.org/wordprocessingml/2006/main" xmlns:w14="http://schemas.microsoft.com/office/word/2010/wordml" xmlns:w15="http://schemas.microsoft.com/office/word/2012/wordml" xmlns:w16cex="http://schemas.microsoft.com/office/word/2018/wordml/cex" xmlns:w16cid="http://schemas.microsoft.com/office/word/2016/wordml/cid" xmlns:w16="http://schemas.microsoft.com/office/word/2018/wordml" xmlns:w16du="http://schemas.microsoft.com/office/word/2023/wordml/word16du" xmlns:w16sdtdh="http://schemas.microsoft.com/office/word/2020/wordml/sdtdatahash" xmlns:w16sdtfl="http://schemas.microsoft.com/office/word/2024/wordml/sdtformatlock" xmlns:w16se="http://schemas.microsoft.com/office/word/2015/wordml/symex" xmlns:wpg="http://schemas.microsoft.com/office/word/2010/wordprocessingGroup" xmlns:wpi="http://schemas.microsoft.com/office/word/2010/wordprocessingInk" xmlns:wne="http://schemas.microsoft.com/office/word/2006/wordml" xmlns:wps="http://schemas.microsoft.com/office/word/2010/wordprocessingShape" mc:Ignorable="w14 w15 w16se w16cid w16 w16cex w16sdtdh w16sdtfl w16du wp14">
+  <w:abstractNum w:abstractNumId="0" w15:restartNumberingAfterBreak="0">
     <w:nsid w:val="0000A990"/>
     <w:multiLevelType w:val="multilevel"/>
+    <w:tmpl w:val="493E5DC4"/>
     <w:lvl w:ilvl="0">
       <w:numFmt w:val="bullet"/>
       <w:lvlText w:val=" "/>
@@ -2131,21 +2289,21 @@
       </w:pPr>
     </w:lvl>
   </w:abstractNum>
-  <w:num w:numId="1000">
-    <w:abstractNumId w:val="990"/>
+  <w:num w:numId="1" w16cid:durableId="1578055347">
+    <w:abstractNumId w:val="0"/>
   </w:num>
 </w:numbering>
 </file>
 
 <file path=word/styles.xml><?xml version="1.0" encoding="utf-8"?>
-<w:styles xmlns:r="http://schemas.openxmlformats.org/officeDocument/2006/relationships" xmlns:w="http://schemas.openxmlformats.org/wordprocessingml/2006/main">
+<w:styles xmlns:mc="http://schemas.openxmlformats.org/markup-compatibility/2006" xmlns:r="http://schemas.openxmlformats.org/officeDocument/2006/relationships" xmlns:w="http://schemas.openxmlformats.org/wordprocessingml/2006/main" xmlns:w14="http://schemas.microsoft.com/office/word/2010/wordml" xmlns:w15="http://schemas.microsoft.com/office/word/2012/wordml" xmlns:w16cex="http://schemas.microsoft.com/office/word/2018/wordml/cex" xmlns:w16cid="http://schemas.microsoft.com/office/word/2016/wordml/cid" xmlns:w16="http://schemas.microsoft.com/office/word/2018/wordml" xmlns:w16du="http://schemas.microsoft.com/office/word/2023/wordml/word16du" xmlns:w16sdtdh="http://schemas.microsoft.com/office/word/2020/wordml/sdtdatahash" xmlns:w16sdtfl="http://schemas.microsoft.com/office/word/2024/wordml/sdtformatlock" xmlns:w16se="http://schemas.microsoft.com/office/word/2015/wordml/symex" mc:Ignorable="w14 w15 w16se w16cid w16 w16cex w16sdtdh w16sdtfl w16du">
   <w:docDefaults>
     <w:rPrDefault>
       <w:rPr>
-        <w:rFonts w:asciiTheme="minorHAnsi" w:cstheme="minorBidi" w:eastAsiaTheme="minorEastAsia" w:hAnsiTheme="minorHAnsi"/>
+        <w:rFonts w:asciiTheme="minorHAnsi" w:eastAsiaTheme="minorEastAsia" w:hAnsiTheme="minorHAnsi" w:cstheme="minorBidi"/>
         <w:sz w:val="24"/>
         <w:szCs w:val="24"/>
-        <w:lang w:bidi="ar-SA" w:eastAsia="zh-CN" w:val="en-US"/>
+        <w:lang w:val="en-US" w:eastAsia="zh-CN" w:bidi="ar-SA"/>
       </w:rPr>
     </w:rPrDefault>
     <w:pPrDefault>
@@ -2154,193 +2312,280 @@
       </w:pPr>
     </w:pPrDefault>
   </w:docDefaults>
-  <w:latentStyles w:count="276" w:defLockedState="0" w:defQFormat="0" w:defSemiHidden="0" w:defUIPriority="0" w:defUnhideWhenUsed="0"/>
-  <w:style w:default="1" w:styleId="Normal" w:type="paragraph">
+  <w:latentStyles w:defLockedState="0" w:defUIPriority="0" w:defSemiHidden="0" w:defUnhideWhenUsed="0" w:defQFormat="0" w:count="376">
+    <w:lsdException w:name="Normal Table" w:semiHidden="1" w:unhideWhenUsed="1"/>
+    <w:lsdException w:name="Table Simple 1" w:semiHidden="1" w:unhideWhenUsed="1"/>
+    <w:lsdException w:name="Table Simple 2" w:semiHidden="1" w:unhideWhenUsed="1"/>
+    <w:lsdException w:name="Table Simple 3" w:semiHidden="1" w:unhideWhenUsed="1"/>
+    <w:lsdException w:name="Table Classic 1" w:semiHidden="1" w:unhideWhenUsed="1"/>
+    <w:lsdException w:name="Table Classic 2" w:semiHidden="1" w:unhideWhenUsed="1"/>
+    <w:lsdException w:name="Table Classic 3" w:semiHidden="1" w:unhideWhenUsed="1"/>
+    <w:lsdException w:name="Table Classic 4" w:semiHidden="1" w:unhideWhenUsed="1"/>
+    <w:lsdException w:name="Table Colorful 1" w:semiHidden="1" w:unhideWhenUsed="1"/>
+    <w:lsdException w:name="Table Colorful 2" w:semiHidden="1" w:unhideWhenUsed="1"/>
+    <w:lsdException w:name="Table Colorful 3" w:semiHidden="1" w:unhideWhenUsed="1"/>
+    <w:lsdException w:name="Table Columns 1" w:semiHidden="1" w:unhideWhenUsed="1"/>
+    <w:lsdException w:name="Table Columns 2" w:semiHidden="1" w:unhideWhenUsed="1"/>
+    <w:lsdException w:name="Table Columns 3" w:semiHidden="1" w:unhideWhenUsed="1"/>
+    <w:lsdException w:name="Table Columns 4" w:semiHidden="1" w:unhideWhenUsed="1"/>
+    <w:lsdException w:name="Table Columns 5" w:semiHidden="1" w:unhideWhenUsed="1"/>
+    <w:lsdException w:name="Table Grid 1" w:semiHidden="1" w:unhideWhenUsed="1"/>
+    <w:lsdException w:name="Table Grid 2" w:semiHidden="1" w:unhideWhenUsed="1"/>
+    <w:lsdException w:name="Table Grid 3" w:semiHidden="1" w:unhideWhenUsed="1"/>
+    <w:lsdException w:name="Table Grid 4" w:semiHidden="1" w:unhideWhenUsed="1"/>
+    <w:lsdException w:name="Table Grid 5" w:semiHidden="1" w:unhideWhenUsed="1"/>
+    <w:lsdException w:name="Table Grid 6" w:semiHidden="1" w:unhideWhenUsed="1"/>
+    <w:lsdException w:name="Table Grid 7" w:semiHidden="1" w:unhideWhenUsed="1"/>
+    <w:lsdException w:name="Table Grid 8" w:semiHidden="1" w:unhideWhenUsed="1"/>
+    <w:lsdException w:name="Table List 1" w:semiHidden="1" w:unhideWhenUsed="1"/>
+    <w:lsdException w:name="Table List 2" w:semiHidden="1" w:unhideWhenUsed="1"/>
+    <w:lsdException w:name="Table List 3" w:semiHidden="1" w:unhideWhenUsed="1"/>
+    <w:lsdException w:name="Table List 4" w:semiHidden="1" w:unhideWhenUsed="1"/>
+    <w:lsdException w:name="Table List 5" w:semiHidden="1" w:unhideWhenUsed="1"/>
+    <w:lsdException w:name="Table List 6" w:semiHidden="1" w:unhideWhenUsed="1"/>
+    <w:lsdException w:name="Table List 7" w:semiHidden="1" w:unhideWhenUsed="1"/>
+    <w:lsdException w:name="Table List 8" w:semiHidden="1" w:unhideWhenUsed="1"/>
+    <w:lsdException w:name="Table 3D effects 1" w:semiHidden="1" w:unhideWhenUsed="1"/>
+    <w:lsdException w:name="Table 3D effects 2" w:semiHidden="1" w:unhideWhenUsed="1"/>
+    <w:lsdException w:name="Table 3D effects 3" w:semiHidden="1" w:unhideWhenUsed="1"/>
+    <w:lsdException w:name="Table Contemporary" w:semiHidden="1" w:unhideWhenUsed="1"/>
+    <w:lsdException w:name="Table Elegant" w:semiHidden="1" w:unhideWhenUsed="1"/>
+    <w:lsdException w:name="Table Professional" w:semiHidden="1" w:unhideWhenUsed="1"/>
+    <w:lsdException w:name="Table Subtle 1" w:semiHidden="1" w:unhideWhenUsed="1"/>
+    <w:lsdException w:name="Table Subtle 2" w:semiHidden="1" w:unhideWhenUsed="1"/>
+    <w:lsdException w:name="Table Web 1" w:semiHidden="1" w:unhideWhenUsed="1"/>
+    <w:lsdException w:name="Table Web 2" w:semiHidden="1" w:unhideWhenUsed="1"/>
+    <w:lsdException w:name="Table Web 3" w:semiHidden="1" w:unhideWhenUsed="1"/>
+    <w:lsdException w:name="Table Theme" w:semiHidden="1" w:unhideWhenUsed="1"/>
+    <w:lsdException w:name="Light Shading"/>
+    <w:lsdException w:name="Light List"/>
+    <w:lsdException w:name="Light Grid"/>
+    <w:lsdException w:name="Medium Shading 1"/>
+    <w:lsdException w:name="Medium Shading 2"/>
+    <w:lsdException w:name="Medium List 1"/>
+    <w:lsdException w:name="Medium List 2"/>
+    <w:lsdException w:name="Medium Grid 1"/>
+    <w:lsdException w:name="Medium Grid 2"/>
+    <w:lsdException w:name="Medium Grid 3"/>
+    <w:lsdException w:name="Dark List"/>
+    <w:lsdException w:name="Colorful Shading"/>
+    <w:lsdException w:name="Colorful List"/>
+    <w:lsdException w:name="Colorful Grid"/>
+    <w:lsdException w:name="Light Shading Accent 1"/>
+    <w:lsdException w:name="Light List Accent 1"/>
+    <w:lsdException w:name="Light Grid Accent 1"/>
+    <w:lsdException w:name="Medium Shading 1 Accent 1"/>
+    <w:lsdException w:name="Medium Shading 2 Accent 1"/>
+    <w:lsdException w:name="Medium List 1 Accent 1"/>
+    <w:lsdException w:name="Medium List 2 Accent 1"/>
+    <w:lsdException w:name="Medium Grid 1 Accent 1"/>
+    <w:lsdException w:name="Medium Grid 2 Accent 1"/>
+    <w:lsdException w:name="Medium Grid 3 Accent 1"/>
+    <w:lsdException w:name="Dark List Accent 1"/>
+    <w:lsdException w:name="Colorful Shading Accent 1"/>
+    <w:lsdException w:name="Colorful List Accent 1"/>
+    <w:lsdException w:name="Colorful Grid Accent 1"/>
+    <w:lsdException w:name="Light Shading Accent 2"/>
+    <w:lsdException w:name="Light List Accent 2"/>
+    <w:lsdException w:name="Light Grid Accent 2"/>
+    <w:lsdException w:name="Medium Shading 1 Accent 2"/>
+    <w:lsdException w:name="Medium Shading 2 Accent 2"/>
+    <w:lsdException w:name="Medium List 1 Accent 2"/>
+    <w:lsdException w:name="Medium List 2 Accent 2"/>
+    <w:lsdException w:name="Medium Grid 1 Accent 2"/>
+    <w:lsdException w:name="Medium Grid 2 Accent 2"/>
+    <w:lsdException w:name="Medium Grid 3 Accent 2"/>
+    <w:lsdException w:name="Dark List Accent 2"/>
+    <w:lsdException w:name="Colorful Shading Accent 2"/>
+    <w:lsdException w:name="Colorful List Accent 2"/>
+    <w:lsdException w:name="Colorful Grid Accent 2"/>
+    <w:lsdException w:name="Light Shading Accent 3"/>
+    <w:lsdException w:name="Light List Accent 3"/>
+    <w:lsdException w:name="Light Grid Accent 3"/>
+    <w:lsdException w:name="Medium Shading 1 Accent 3"/>
+    <w:lsdException w:name="Medium Shading 2 Accent 3"/>
+    <w:lsdException w:name="Medium List 1 Accent 3"/>
+    <w:lsdException w:name="Medium List 2 Accent 3"/>
+    <w:lsdException w:name="Medium Grid 1 Accent 3"/>
+    <w:lsdException w:name="Medium Grid 2 Accent 3"/>
+    <w:lsdException w:name="Medium Grid 3 Accent 3"/>
+    <w:lsdException w:name="Dark List Accent 3"/>
+    <w:lsdException w:name="Colorful Shading Accent 3"/>
+    <w:lsdException w:name="Colorful List Accent 3"/>
+    <w:lsdException w:name="Colorful Grid Accent 3"/>
+    <w:lsdException w:name="Light Shading Accent 4"/>
+    <w:lsdException w:name="Light List Accent 4"/>
+    <w:lsdException w:name="Light Grid Accent 4"/>
+    <w:lsdException w:name="Medium Shading 1 Accent 4"/>
+    <w:lsdException w:name="Medium Shading 2 Accent 4"/>
+    <w:lsdException w:name="Medium List 1 Accent 4"/>
+    <w:lsdException w:name="Medium List 2 Accent 4"/>
+    <w:lsdException w:name="Medium Grid 1 Accent 4"/>
+    <w:lsdException w:name="Medium Grid 2 Accent 4"/>
+    <w:lsdException w:name="Medium Grid 3 Accent 4"/>
+    <w:lsdException w:name="Dark List Accent 4"/>
+    <w:lsdException w:name="Colorful Shading Accent 4"/>
+    <w:lsdException w:name="Colorful List Accent 4"/>
+    <w:lsdException w:name="Colorful Grid Accent 4"/>
+    <w:lsdException w:name="Light Shading Accent 5"/>
+    <w:lsdException w:name="Light List Accent 5"/>
+    <w:lsdException w:name="Light Grid Accent 5"/>
+    <w:lsdException w:name="Medium Shading 1 Accent 5"/>
+    <w:lsdException w:name="Medium Shading 2 Accent 5"/>
+    <w:lsdException w:name="Medium List 1 Accent 5"/>
+    <w:lsdException w:name="Medium List 2 Accent 5"/>
+    <w:lsdException w:name="Medium Grid 1 Accent 5"/>
+    <w:lsdException w:name="Medium Grid 2 Accent 5"/>
+    <w:lsdException w:name="Medium Grid 3 Accent 5"/>
+    <w:lsdException w:name="Dark List Accent 5"/>
+    <w:lsdException w:name="Colorful Shading Accent 5"/>
+    <w:lsdException w:name="Colorful List Accent 5"/>
+    <w:lsdException w:name="Colorful Grid Accent 5"/>
+    <w:lsdException w:name="Light Shading Accent 6"/>
+    <w:lsdException w:name="Light List Accent 6"/>
+    <w:lsdException w:name="Light Grid Accent 6"/>
+    <w:lsdException w:name="Medium Shading 1 Accent 6"/>
+    <w:lsdException w:name="Medium Shading 2 Accent 6"/>
+    <w:lsdException w:name="Medium List 1 Accent 6"/>
+    <w:lsdException w:name="Medium List 2 Accent 6"/>
+    <w:lsdException w:name="Medium Grid 1 Accent 6"/>
+    <w:lsdException w:name="Medium Grid 2 Accent 6"/>
+    <w:lsdException w:name="Medium Grid 3 Accent 6"/>
+    <w:lsdException w:name="Dark List Accent 6"/>
+    <w:lsdException w:name="Colorful Shading Accent 6"/>
+    <w:lsdException w:name="Colorful List Accent 6"/>
+    <w:lsdException w:name="Colorful Grid Accent 6"/>
+    <w:lsdException w:name="Grid Table 4" w:uiPriority="49"/>
+    <w:lsdException w:name="Grid Table 5 Dark" w:uiPriority="50"/>
+    <w:lsdException w:name="Grid Table 6 Colorful" w:uiPriority="51"/>
+    <w:lsdException w:name="Grid Table 7 Colorful" w:uiPriority="52"/>
+    <w:lsdException w:name="Grid Table 1 Light Accent 1" w:uiPriority="46"/>
+    <w:lsdException w:name="Grid Table 2 Accent 1" w:uiPriority="47"/>
+    <w:lsdException w:name="Grid Table 3 Accent 1" w:uiPriority="48"/>
+    <w:lsdException w:name="Grid Table 4 Accent 1" w:uiPriority="49"/>
+    <w:lsdException w:name="Grid Table 5 Dark Accent 1" w:uiPriority="50"/>
+    <w:lsdException w:name="Grid Table 6 Colorful Accent 1" w:uiPriority="51"/>
+    <w:lsdException w:name="Grid Table 7 Colorful Accent 1" w:uiPriority="52"/>
+    <w:lsdException w:name="Grid Table 1 Light Accent 2" w:uiPriority="46"/>
+    <w:lsdException w:name="Grid Table 2 Accent 2" w:uiPriority="47"/>
+    <w:lsdException w:name="Grid Table 3 Accent 2" w:uiPriority="48"/>
+    <w:lsdException w:name="Grid Table 4 Accent 2" w:uiPriority="49"/>
+    <w:lsdException w:name="Grid Table 5 Dark Accent 2" w:uiPriority="50"/>
+    <w:lsdException w:name="Grid Table 6 Colorful Accent 2" w:uiPriority="51"/>
+    <w:lsdException w:name="Grid Table 7 Colorful Accent 2" w:uiPriority="52"/>
+    <w:lsdException w:name="Grid Table 1 Light Accent 3" w:uiPriority="46"/>
+    <w:lsdException w:name="Grid Table 2 Accent 3" w:uiPriority="47"/>
+    <w:lsdException w:name="Grid Table 3 Accent 3" w:uiPriority="48"/>
+    <w:lsdException w:name="Grid Table 4 Accent 3" w:uiPriority="49"/>
+    <w:lsdException w:name="Grid Table 5 Dark Accent 3" w:uiPriority="50"/>
+    <w:lsdException w:name="Grid Table 6 Colorful Accent 3" w:uiPriority="51"/>
+    <w:lsdException w:name="Grid Table 7 Colorful Accent 3" w:uiPriority="52"/>
+    <w:lsdException w:name="Grid Table 1 Light Accent 4" w:uiPriority="46"/>
+    <w:lsdException w:name="Grid Table 2 Accent 4" w:uiPriority="47"/>
+    <w:lsdException w:name="Grid Table 3 Accent 4" w:uiPriority="48"/>
+    <w:lsdException w:name="Grid Table 4 Accent 4" w:uiPriority="49"/>
+    <w:lsdException w:name="Grid Table 5 Dark Accent 4" w:uiPriority="50"/>
+    <w:lsdException w:name="Grid Table 6 Colorful Accent 4" w:uiPriority="51"/>
+    <w:lsdException w:name="Grid Table 7 Colorful Accent 4" w:uiPriority="52"/>
+    <w:lsdException w:name="Grid Table 1 Light Accent 5" w:uiPriority="46"/>
+    <w:lsdException w:name="Grid Table 2 Accent 5" w:uiPriority="47"/>
+    <w:lsdException w:name="Grid Table 3 Accent 5" w:uiPriority="48"/>
+    <w:lsdException w:name="Grid Table 4 Accent 5" w:uiPriority="49"/>
+    <w:lsdException w:name="Grid Table 5 Dark Accent 5" w:uiPriority="50"/>
+    <w:lsdException w:name="Grid Table 6 Colorful Accent 5" w:uiPriority="51"/>
+    <w:lsdException w:name="Grid Table 7 Colorful Accent 5" w:uiPriority="52"/>
+    <w:lsdException w:name="Grid Table 1 Light Accent 6" w:uiPriority="46"/>
+    <w:lsdException w:name="Grid Table 2 Accent 6" w:uiPriority="47"/>
+    <w:lsdException w:name="Grid Table 3 Accent 6" w:uiPriority="48"/>
+    <w:lsdException w:name="Grid Table 4 Accent 6" w:uiPriority="49"/>
+    <w:lsdException w:name="Grid Table 5 Dark Accent 6" w:uiPriority="50"/>
+    <w:lsdException w:name="Grid Table 6 Colorful Accent 6" w:uiPriority="51"/>
+    <w:lsdException w:name="Grid Table 7 Colorful Accent 6" w:uiPriority="52"/>
+    <w:lsdException w:name="List Table 1 Light" w:uiPriority="46"/>
+    <w:lsdException w:name="List Table 2" w:uiPriority="47"/>
+    <w:lsdException w:name="List Table 3" w:uiPriority="48"/>
+    <w:lsdException w:name="List Table 4" w:uiPriority="49"/>
+    <w:lsdException w:name="List Table 5 Dark" w:uiPriority="50"/>
+    <w:lsdException w:name="List Table 6 Colorful" w:uiPriority="51"/>
+    <w:lsdException w:name="List Table 7 Colorful" w:uiPriority="52"/>
+    <w:lsdException w:name="List Table 1 Light Accent 1" w:uiPriority="46"/>
+    <w:lsdException w:name="List Table 2 Accent 1" w:uiPriority="47"/>
+    <w:lsdException w:name="List Table 3 Accent 1" w:uiPriority="48"/>
+    <w:lsdException w:name="List Table 4 Accent 1" w:uiPriority="49"/>
+    <w:lsdException w:name="List Table 5 Dark Accent 1" w:uiPriority="50"/>
+    <w:lsdException w:name="List Table 6 Colorful Accent 1" w:uiPriority="51"/>
+    <w:lsdException w:name="List Table 7 Colorful Accent 1" w:uiPriority="52"/>
+    <w:lsdException w:name="List Table 1 Light Accent 2" w:uiPriority="46"/>
+    <w:lsdException w:name="List Table 2 Accent 2" w:uiPriority="47"/>
+    <w:lsdException w:name="List Table 3 Accent 2" w:uiPriority="48"/>
+    <w:lsdException w:name="List Table 4 Accent 2" w:uiPriority="49"/>
+    <w:lsdException w:name="List Table 5 Dark Accent 2" w:uiPriority="50"/>
+    <w:lsdException w:name="List Table 6 Colorful Accent 2" w:uiPriority="51"/>
+    <w:lsdException w:name="List Table 7 Colorful Accent 2" w:uiPriority="52"/>
+    <w:lsdException w:name="List Table 1 Light Accent 3" w:uiPriority="46"/>
+    <w:lsdException w:name="List Table 2 Accent 3" w:uiPriority="47"/>
+    <w:lsdException w:name="List Table 3 Accent 3" w:uiPriority="48"/>
+    <w:lsdException w:name="List Table 4 Accent 3" w:uiPriority="49"/>
+    <w:lsdException w:name="List Table 5 Dark Accent 3" w:uiPriority="50"/>
+    <w:lsdException w:name="List Table 6 Colorful Accent 3" w:uiPriority="51"/>
+    <w:lsdException w:name="List Table 7 Colorful Accent 3" w:uiPriority="52"/>
+    <w:lsdException w:name="List Table 1 Light Accent 4" w:uiPriority="46"/>
+    <w:lsdException w:name="List Table 2 Accent 4" w:uiPriority="47"/>
+    <w:lsdException w:name="List Table 3 Accent 4" w:uiPriority="48"/>
+    <w:lsdException w:name="List Table 4 Accent 4" w:uiPriority="49"/>
+    <w:lsdException w:name="List Table 5 Dark Accent 4" w:uiPriority="50"/>
+    <w:lsdException w:name="List Table 6 Colorful Accent 4" w:uiPriority="51"/>
+    <w:lsdException w:name="List Table 7 Colorful Accent 4" w:uiPriority="52"/>
+    <w:lsdException w:name="List Table 1 Light Accent 5" w:uiPriority="46"/>
+    <w:lsdException w:name="List Table 2 Accent 5" w:uiPriority="47"/>
+    <w:lsdException w:name="List Table 3 Accent 5" w:uiPriority="48"/>
+    <w:lsdException w:name="List Table 4 Accent 5" w:uiPriority="49"/>
+    <w:lsdException w:name="List Table 5 Dark Accent 5" w:uiPriority="50"/>
+    <w:lsdException w:name="List Table 6 Colorful Accent 5" w:uiPriority="51"/>
+    <w:lsdException w:name="List Table 7 Colorful Accent 5" w:uiPriority="52"/>
+    <w:lsdException w:name="List Table 1 Light Accent 6" w:uiPriority="46"/>
+    <w:lsdException w:name="List Table 2 Accent 6" w:uiPriority="47"/>
+    <w:lsdException w:name="List Table 3 Accent 6" w:uiPriority="48"/>
+    <w:lsdException w:name="List Table 4 Accent 6" w:uiPriority="49"/>
+    <w:lsdException w:name="List Table 5 Dark Accent 6" w:uiPriority="50"/>
+    <w:lsdException w:name="List Table 6 Colorful Accent 6" w:uiPriority="51"/>
+    <w:lsdException w:name="List Table 7 Colorful Accent 6" w:uiPriority="52"/>
+    <w:lsdException w:name="Mention" w:semiHidden="1" w:uiPriority="99" w:unhideWhenUsed="1"/>
+    <w:lsdException w:name="Smart Hyperlink" w:semiHidden="1" w:uiPriority="99" w:unhideWhenUsed="1"/>
+    <w:lsdException w:name="Hashtag" w:semiHidden="1" w:uiPriority="99" w:unhideWhenUsed="1"/>
+    <w:lsdException w:name="Unresolved Mention" w:semiHidden="1" w:uiPriority="99" w:unhideWhenUsed="1"/>
+    <w:lsdException w:name="Smart Link" w:semiHidden="1" w:uiPriority="99" w:unhideWhenUsed="1"/>
+  </w:latentStyles>
+  <w:style w:type="paragraph" w:default="1" w:styleId="Normal">
     <w:name w:val="Normal"/>
     <w:qFormat/>
   </w:style>
-  <w:style w:styleId="BodyText" w:type="paragraph">
-    <w:name w:val="Body Text"/>
-    <w:basedOn w:val="Normal"/>
-    <w:link w:val="BodyTextChar"/>
-    <w:qFormat/>
-    <w:pPr>
-      <w:spacing w:after="180" w:before="180"/>
-    </w:pPr>
-  </w:style>
-  <w:style w:customStyle="1" w:styleId="FirstParagraph" w:type="paragraph">
-    <w:name w:val="First Paragraph"/>
-    <w:basedOn w:val="BodyText"/>
-    <w:next w:val="BodyText"/>
-    <w:qFormat/>
-  </w:style>
-  <w:style w:customStyle="1" w:styleId="Compact" w:type="paragraph">
-    <w:name w:val="Compact"/>
-    <w:basedOn w:val="BodyText"/>
-    <w:qFormat/>
-    <w:pPr>
-      <w:spacing w:after="36" w:before="36"/>
-    </w:pPr>
-  </w:style>
-  <w:style w:styleId="Title" w:type="paragraph">
-    <w:name w:val="Title"/>
-    <w:basedOn w:val="Normal"/>
-    <w:next w:val="BodyText"/>
-    <w:link w:val="TitleChar"/>
-    <w:uiPriority w:val="10"/>
-    <w:qFormat/>
-    <w:rsid w:val="00A10FD9"/>
-    <w:pPr>
-      <w:spacing w:after="80" w:line="240" w:lineRule="auto"/>
-      <w:contextualSpacing/>
-      <w:jc w:val="center"/>
-    </w:pPr>
-    <w:rPr>
-      <w:rFonts w:asciiTheme="majorHAnsi" w:cstheme="majorBidi" w:eastAsiaTheme="majorEastAsia" w:hAnsiTheme="majorHAnsi"/>
-      <w:sz w:val="56"/>
-      <w:szCs w:val="56"/>
-    </w:rPr>
-  </w:style>
-  <w:style w:customStyle="1" w:styleId="TitleChar" w:type="character">
-    <w:name w:val="Title Char"/>
-    <w:basedOn w:val="DefaultParagraphFont"/>
-    <w:link w:val="Title"/>
-    <w:uiPriority w:val="10"/>
-    <w:rsid w:val="00A10FD9"/>
-    <w:rPr>
-      <w:rFonts w:asciiTheme="majorHAnsi" w:cstheme="majorBidi" w:eastAsiaTheme="majorEastAsia" w:hAnsiTheme="majorHAnsi"/>
-      <w:sz w:val="56"/>
-      <w:szCs w:val="56"/>
-    </w:rPr>
-  </w:style>
-  <w:style w:styleId="Subtitle" w:type="paragraph">
-    <w:name w:val="Subtitle"/>
-    <w:basedOn w:val="Title"/>
-    <w:next w:val="BodyText"/>
-    <w:link w:val="SubtitleChar"/>
-    <w:uiPriority w:val="11"/>
-    <w:qFormat/>
-    <w:rsid w:val="00A10FD9"/>
-    <w:pPr>
-      <w:numPr>
-        <w:ilvl w:val="1"/>
-      </w:numPr>
-    </w:pPr>
-    <w:rPr>
-      <w:rFonts w:cstheme="majorBidi" w:eastAsiaTheme="majorEastAsia"/>
-      <w:spacing w:val="15"/>
-      <w:sz w:val="28"/>
-      <w:szCs w:val="28"/>
-    </w:rPr>
-  </w:style>
-  <w:style w:customStyle="1" w:styleId="SubtitleChar" w:type="character">
-    <w:name w:val="Subtitle Char"/>
-    <w:basedOn w:val="DefaultParagraphFont"/>
-    <w:link w:val="Subtitle"/>
-    <w:uiPriority w:val="11"/>
-    <w:rsid w:val="00A10FD9"/>
-    <w:rPr>
-      <w:rFonts w:cstheme="majorBidi" w:eastAsiaTheme="majorEastAsia"/>
-      <w:color w:themeColor="text1" w:themeTint="A6" w:val="595959"/>
-      <w:spacing w:val="15"/>
-      <w:sz w:val="28"/>
-      <w:szCs w:val="28"/>
-    </w:rPr>
-  </w:style>
-  <w:style w:customStyle="1" w:styleId="Author" w:type="paragraph">
-    <w:name w:val="Author"/>
-    <w:basedOn w:val="Title"/>
-    <w:next w:val="BodyText"/>
-    <w:qFormat/>
-    <w:pPr>
-      <w:keepNext/>
-      <w:keepLines/>
-    </w:pPr>
-    <w:rPr>
-      <w:sz w:val="24"/>
-      <w:szCs w:val="24"/>
-    </w:rPr>
-  </w:style>
-  <w:style w:styleId="Date" w:type="paragraph">
-    <w:name w:val="Date"/>
-    <w:basedOn w:val="Title"/>
-    <w:next w:val="BodyText"/>
-    <w:qFormat/>
-    <w:pPr>
-      <w:keepNext/>
-      <w:keepLines/>
-    </w:pPr>
-    <w:rPr>
-      <w:sz w:val="24"/>
-      <w:szCs w:val="24"/>
-    </w:rPr>
-  </w:style>
-  <w:style w:customStyle="1" w:styleId="AbstractTitle" w:type="paragraph">
-    <w:name w:val="Abstract Title"/>
-    <w:basedOn w:val="Normal"/>
-    <w:next w:val="Abstract"/>
-    <w:qFormat/>
-    <w:pPr>
-      <w:keepNext/>
-      <w:keepLines/>
-      <w:spacing w:after="0" w:before="300"/>
-      <w:jc w:val="center"/>
-    </w:pPr>
-    <w:rPr>
-      <w:b/>
-      <w:sz w:val="20"/>
-      <w:szCs w:val="20"/>
-    </w:rPr>
-  </w:style>
-  <w:style w:customStyle="1" w:styleId="Abstract" w:type="paragraph">
-    <w:name w:val="Abstract"/>
-    <w:basedOn w:val="Normal"/>
-    <w:next w:val="BodyText"/>
-    <w:qFormat/>
-    <w:pPr>
-      <w:keepNext/>
-      <w:keepLines/>
-      <w:spacing w:after="300" w:before="100"/>
-    </w:pPr>
-    <w:rPr>
-      <w:sz w:val="20"/>
-      <w:szCs w:val="20"/>
-    </w:rPr>
-  </w:style>
-  <w:style w:styleId="Bibliography" w:type="paragraph">
-    <w:name w:val="Bibliography"/>
-    <w:basedOn w:val="Normal"/>
-    <w:next w:val="Bibliography"/>
-    <w:qFormat/>
-    <w:pPr/>
-    <w:rPr/>
-  </w:style>
-  <w:style w:styleId="Heading1" w:type="paragraph">
+  <w:style w:type="paragraph" w:styleId="Ttulo1">
     <w:name w:val="heading 1"/>
     <w:basedOn w:val="Normal"/>
-    <w:next w:val="BodyText"/>
-    <w:link w:val="Heading1Char"/>
+    <w:next w:val="Textoindependiente"/>
+    <w:link w:val="Ttulo1Car"/>
     <w:uiPriority w:val="9"/>
     <w:qFormat/>
     <w:rsid w:val="00A10FD9"/>
     <w:pPr>
       <w:keepNext/>
       <w:keepLines/>
-      <w:spacing w:after="80" w:before="360"/>
+      <w:spacing w:before="360" w:after="80"/>
       <w:outlineLvl w:val="0"/>
     </w:pPr>
     <w:rPr>
-      <w:rFonts w:asciiTheme="majorHAnsi" w:cstheme="majorBidi" w:eastAsiaTheme="majorEastAsia" w:hAnsiTheme="majorHAnsi"/>
-      <w:color w:themeColor="accent1" w:themeShade="BF" w:val="0F4761"/>
+      <w:rFonts w:asciiTheme="majorHAnsi" w:eastAsiaTheme="majorEastAsia" w:hAnsiTheme="majorHAnsi" w:cstheme="majorBidi"/>
+      <w:color w:val="0F4761" w:themeColor="accent1" w:themeShade="BF"/>
       <w:sz w:val="40"/>
       <w:szCs w:val="40"/>
     </w:rPr>
   </w:style>
-  <w:style w:styleId="Heading2" w:type="paragraph">
+  <w:style w:type="paragraph" w:styleId="Ttulo2">
     <w:name w:val="heading 2"/>
     <w:basedOn w:val="Normal"/>
-    <w:next w:val="BodyText"/>
-    <w:link w:val="Heading2Char"/>
+    <w:next w:val="Textoindependiente"/>
+    <w:link w:val="Ttulo2Car"/>
     <w:uiPriority w:val="9"/>
     <w:semiHidden/>
     <w:unhideWhenUsed/>
@@ -2349,21 +2594,21 @@
     <w:pPr>
       <w:keepNext/>
       <w:keepLines/>
-      <w:spacing w:after="80" w:before="160"/>
+      <w:spacing w:before="160" w:after="80"/>
       <w:outlineLvl w:val="1"/>
     </w:pPr>
     <w:rPr>
-      <w:rFonts w:asciiTheme="majorHAnsi" w:cstheme="majorBidi" w:eastAsiaTheme="majorEastAsia" w:hAnsiTheme="majorHAnsi"/>
-      <w:color w:themeColor="accent1" w:themeShade="BF" w:val="0F4761"/>
+      <w:rFonts w:asciiTheme="majorHAnsi" w:eastAsiaTheme="majorEastAsia" w:hAnsiTheme="majorHAnsi" w:cstheme="majorBidi"/>
+      <w:color w:val="0F4761" w:themeColor="accent1" w:themeShade="BF"/>
       <w:sz w:val="32"/>
       <w:szCs w:val="32"/>
     </w:rPr>
   </w:style>
-  <w:style w:styleId="Heading3" w:type="paragraph">
+  <w:style w:type="paragraph" w:styleId="Ttulo3">
     <w:name w:val="heading 3"/>
     <w:basedOn w:val="Normal"/>
-    <w:next w:val="BodyText"/>
-    <w:link w:val="Heading3Char"/>
+    <w:next w:val="Textoindependiente"/>
+    <w:link w:val="Ttulo3Car"/>
     <w:uiPriority w:val="9"/>
     <w:semiHidden/>
     <w:unhideWhenUsed/>
@@ -2372,21 +2617,21 @@
     <w:pPr>
       <w:keepNext/>
       <w:keepLines/>
-      <w:spacing w:after="80" w:before="160"/>
+      <w:spacing w:before="160" w:after="80"/>
       <w:outlineLvl w:val="2"/>
     </w:pPr>
     <w:rPr>
-      <w:rFonts w:cstheme="majorBidi" w:eastAsiaTheme="majorEastAsia"/>
-      <w:color w:themeColor="accent1" w:themeShade="BF" w:val="0F4761"/>
+      <w:rFonts w:eastAsiaTheme="majorEastAsia" w:cstheme="majorBidi"/>
+      <w:color w:val="0F4761" w:themeColor="accent1" w:themeShade="BF"/>
       <w:sz w:val="28"/>
       <w:szCs w:val="28"/>
     </w:rPr>
   </w:style>
-  <w:style w:styleId="Heading4" w:type="paragraph">
+  <w:style w:type="paragraph" w:styleId="Ttulo4">
     <w:name w:val="heading 4"/>
     <w:basedOn w:val="Normal"/>
-    <w:next w:val="BodyText"/>
-    <w:link w:val="Heading4Char"/>
+    <w:next w:val="Textoindependiente"/>
+    <w:link w:val="Ttulo4Car"/>
     <w:uiPriority w:val="9"/>
     <w:semiHidden/>
     <w:unhideWhenUsed/>
@@ -2395,21 +2640,21 @@
     <w:pPr>
       <w:keepNext/>
       <w:keepLines/>
-      <w:spacing w:after="40" w:before="80"/>
+      <w:spacing w:before="80" w:after="40"/>
       <w:outlineLvl w:val="3"/>
     </w:pPr>
     <w:rPr>
-      <w:rFonts w:cstheme="majorBidi" w:eastAsiaTheme="majorEastAsia"/>
+      <w:rFonts w:eastAsiaTheme="majorEastAsia" w:cstheme="majorBidi"/>
       <w:i/>
       <w:iCs/>
-      <w:color w:themeColor="accent1" w:themeShade="BF" w:val="0F4761"/>
-    </w:rPr>
-  </w:style>
-  <w:style w:styleId="Heading5" w:type="paragraph">
+      <w:color w:val="0F4761" w:themeColor="accent1" w:themeShade="BF"/>
+    </w:rPr>
+  </w:style>
+  <w:style w:type="paragraph" w:styleId="Ttulo5">
     <w:name w:val="heading 5"/>
     <w:basedOn w:val="Normal"/>
-    <w:next w:val="BodyText"/>
-    <w:link w:val="Heading5Char"/>
+    <w:next w:val="Textoindependiente"/>
+    <w:link w:val="Ttulo5Car"/>
     <w:uiPriority w:val="9"/>
     <w:semiHidden/>
     <w:unhideWhenUsed/>
@@ -2418,19 +2663,19 @@
     <w:pPr>
       <w:keepNext/>
       <w:keepLines/>
-      <w:spacing w:after="40" w:before="80"/>
+      <w:spacing w:before="80" w:after="40"/>
       <w:outlineLvl w:val="4"/>
     </w:pPr>
     <w:rPr>
-      <w:rFonts w:cstheme="majorBidi" w:eastAsiaTheme="majorEastAsia"/>
-      <w:color w:themeColor="accent1" w:themeShade="BF" w:val="0F4761"/>
-    </w:rPr>
-  </w:style>
-  <w:style w:styleId="Heading6" w:type="paragraph">
+      <w:rFonts w:eastAsiaTheme="majorEastAsia" w:cstheme="majorBidi"/>
+      <w:color w:val="0F4761" w:themeColor="accent1" w:themeShade="BF"/>
+    </w:rPr>
+  </w:style>
+  <w:style w:type="paragraph" w:styleId="Ttulo6">
     <w:name w:val="heading 6"/>
     <w:basedOn w:val="Normal"/>
-    <w:next w:val="BodyText"/>
-    <w:link w:val="Heading6Char"/>
+    <w:next w:val="Textoindependiente"/>
+    <w:link w:val="Ttulo6Car"/>
     <w:uiPriority w:val="9"/>
     <w:semiHidden/>
     <w:unhideWhenUsed/>
@@ -2439,21 +2684,21 @@
     <w:pPr>
       <w:keepNext/>
       <w:keepLines/>
-      <w:spacing w:after="0" w:before="40"/>
+      <w:spacing w:before="40" w:after="0"/>
       <w:outlineLvl w:val="5"/>
     </w:pPr>
     <w:rPr>
-      <w:rFonts w:cstheme="majorBidi" w:eastAsiaTheme="majorEastAsia"/>
+      <w:rFonts w:eastAsiaTheme="majorEastAsia" w:cstheme="majorBidi"/>
       <w:i/>
       <w:iCs/>
-      <w:color w:themeColor="text1" w:themeTint="A6" w:val="595959"/>
-    </w:rPr>
-  </w:style>
-  <w:style w:styleId="Heading7" w:type="paragraph">
+      <w:color w:val="595959" w:themeColor="text1" w:themeTint="A6"/>
+    </w:rPr>
+  </w:style>
+  <w:style w:type="paragraph" w:styleId="Ttulo7">
     <w:name w:val="heading 7"/>
     <w:basedOn w:val="Normal"/>
-    <w:next w:val="BodyText"/>
-    <w:link w:val="Heading7Char"/>
+    <w:next w:val="Textoindependiente"/>
+    <w:link w:val="Ttulo7Car"/>
     <w:uiPriority w:val="9"/>
     <w:semiHidden/>
     <w:unhideWhenUsed/>
@@ -2462,19 +2707,19 @@
     <w:pPr>
       <w:keepNext/>
       <w:keepLines/>
-      <w:spacing w:after="0" w:before="40"/>
+      <w:spacing w:before="40" w:after="0"/>
       <w:outlineLvl w:val="6"/>
     </w:pPr>
     <w:rPr>
-      <w:rFonts w:cstheme="majorBidi" w:eastAsiaTheme="majorEastAsia"/>
-      <w:color w:themeColor="text1" w:themeTint="A6" w:val="595959"/>
-    </w:rPr>
-  </w:style>
-  <w:style w:styleId="Heading8" w:type="paragraph">
+      <w:rFonts w:eastAsiaTheme="majorEastAsia" w:cstheme="majorBidi"/>
+      <w:color w:val="595959" w:themeColor="text1" w:themeTint="A6"/>
+    </w:rPr>
+  </w:style>
+  <w:style w:type="paragraph" w:styleId="Ttulo8">
     <w:name w:val="heading 8"/>
     <w:basedOn w:val="Normal"/>
-    <w:next w:val="BodyText"/>
-    <w:link w:val="Heading8Char"/>
+    <w:next w:val="Textoindependiente"/>
+    <w:link w:val="Ttulo8Car"/>
     <w:uiPriority w:val="9"/>
     <w:semiHidden/>
     <w:unhideWhenUsed/>
@@ -2487,17 +2732,17 @@
       <w:outlineLvl w:val="7"/>
     </w:pPr>
     <w:rPr>
-      <w:rFonts w:cstheme="majorBidi" w:eastAsiaTheme="majorEastAsia"/>
+      <w:rFonts w:eastAsiaTheme="majorEastAsia" w:cstheme="majorBidi"/>
       <w:i/>
       <w:iCs/>
-      <w:color w:themeColor="text1" w:themeTint="D8" w:val="272727"/>
-    </w:rPr>
-  </w:style>
-  <w:style w:styleId="Heading9" w:type="paragraph">
+      <w:color w:val="272727" w:themeColor="text1" w:themeTint="D8"/>
+    </w:rPr>
+  </w:style>
+  <w:style w:type="paragraph" w:styleId="Ttulo9">
     <w:name w:val="heading 9"/>
     <w:basedOn w:val="Normal"/>
-    <w:next w:val="BodyText"/>
-    <w:link w:val="Heading9Char"/>
+    <w:next w:val="Textoindependiente"/>
+    <w:link w:val="Ttulo9Car"/>
     <w:uiPriority w:val="9"/>
     <w:semiHidden/>
     <w:unhideWhenUsed/>
@@ -2510,191 +2755,363 @@
       <w:outlineLvl w:val="8"/>
     </w:pPr>
     <w:rPr>
-      <w:rFonts w:cstheme="majorBidi" w:eastAsiaTheme="majorEastAsia"/>
-      <w:color w:themeColor="text1" w:themeTint="D8" w:val="272727"/>
-    </w:rPr>
-  </w:style>
-  <w:style w:customStyle="1" w:styleId="Heading1Char" w:type="character">
-    <w:name w:val="Heading 1 Char"/>
-    <w:basedOn w:val="DefaultParagraphFont"/>
-    <w:link w:val="Heading1"/>
+      <w:rFonts w:eastAsiaTheme="majorEastAsia" w:cstheme="majorBidi"/>
+      <w:color w:val="272727" w:themeColor="text1" w:themeTint="D8"/>
+    </w:rPr>
+  </w:style>
+  <w:style w:type="character" w:default="1" w:styleId="Fuentedeprrafopredeter">
+    <w:name w:val="Default Paragraph Font"/>
+    <w:uiPriority w:val="1"/>
+    <w:semiHidden/>
+    <w:unhideWhenUsed/>
+  </w:style>
+  <w:style w:type="table" w:default="1" w:styleId="Tablanormal">
+    <w:name w:val="Normal Table"/>
+    <w:uiPriority w:val="99"/>
+    <w:semiHidden/>
+    <w:unhideWhenUsed/>
+    <w:tblPr>
+      <w:tblInd w:w="0" w:type="dxa"/>
+      <w:tblCellMar>
+        <w:top w:w="0" w:type="dxa"/>
+        <w:left w:w="108" w:type="dxa"/>
+        <w:bottom w:w="0" w:type="dxa"/>
+        <w:right w:w="108" w:type="dxa"/>
+      </w:tblCellMar>
+    </w:tblPr>
+  </w:style>
+  <w:style w:type="numbering" w:default="1" w:styleId="Sinlista">
+    <w:name w:val="No List"/>
+    <w:uiPriority w:val="99"/>
+    <w:semiHidden/>
+    <w:unhideWhenUsed/>
+  </w:style>
+  <w:style w:type="paragraph" w:styleId="Textoindependiente">
+    <w:name w:val="Body Text"/>
+    <w:basedOn w:val="Normal"/>
+    <w:qFormat/>
+    <w:pPr>
+      <w:spacing w:before="180" w:after="180"/>
+    </w:pPr>
+  </w:style>
+  <w:style w:type="paragraph" w:customStyle="1" w:styleId="FirstParagraph">
+    <w:name w:val="First Paragraph"/>
+    <w:basedOn w:val="Textoindependiente"/>
+    <w:next w:val="Textoindependiente"/>
+    <w:qFormat/>
+  </w:style>
+  <w:style w:type="paragraph" w:customStyle="1" w:styleId="Compact">
+    <w:name w:val="Compact"/>
+    <w:basedOn w:val="Textoindependiente"/>
+    <w:qFormat/>
+    <w:pPr>
+      <w:spacing w:before="36" w:after="36"/>
+    </w:pPr>
+  </w:style>
+  <w:style w:type="paragraph" w:styleId="Ttulo">
+    <w:name w:val="Title"/>
+    <w:basedOn w:val="Normal"/>
+    <w:next w:val="Textoindependiente"/>
+    <w:link w:val="TtuloCar"/>
+    <w:uiPriority w:val="10"/>
+    <w:qFormat/>
+    <w:rsid w:val="00A10FD9"/>
+    <w:pPr>
+      <w:spacing w:after="80"/>
+      <w:contextualSpacing/>
+      <w:jc w:val="center"/>
+    </w:pPr>
+    <w:rPr>
+      <w:rFonts w:asciiTheme="majorHAnsi" w:eastAsiaTheme="majorEastAsia" w:hAnsiTheme="majorHAnsi" w:cstheme="majorBidi"/>
+      <w:sz w:val="56"/>
+      <w:szCs w:val="56"/>
+    </w:rPr>
+  </w:style>
+  <w:style w:type="character" w:customStyle="1" w:styleId="TtuloCar">
+    <w:name w:val="Título Car"/>
+    <w:basedOn w:val="Fuentedeprrafopredeter"/>
+    <w:link w:val="Ttulo"/>
+    <w:uiPriority w:val="10"/>
+    <w:rsid w:val="00A10FD9"/>
+    <w:rPr>
+      <w:rFonts w:asciiTheme="majorHAnsi" w:eastAsiaTheme="majorEastAsia" w:hAnsiTheme="majorHAnsi" w:cstheme="majorBidi"/>
+      <w:sz w:val="56"/>
+      <w:szCs w:val="56"/>
+    </w:rPr>
+  </w:style>
+  <w:style w:type="paragraph" w:styleId="Subttulo">
+    <w:name w:val="Subtitle"/>
+    <w:basedOn w:val="Ttulo"/>
+    <w:next w:val="Textoindependiente"/>
+    <w:link w:val="SubttuloCar"/>
+    <w:uiPriority w:val="11"/>
+    <w:qFormat/>
+    <w:rsid w:val="00A10FD9"/>
+    <w:pPr>
+      <w:numPr>
+        <w:ilvl w:val="1"/>
+      </w:numPr>
+    </w:pPr>
+    <w:rPr>
+      <w:spacing w:val="15"/>
+      <w:sz w:val="28"/>
+      <w:szCs w:val="28"/>
+    </w:rPr>
+  </w:style>
+  <w:style w:type="character" w:customStyle="1" w:styleId="SubttuloCar">
+    <w:name w:val="Subtítulo Car"/>
+    <w:basedOn w:val="Fuentedeprrafopredeter"/>
+    <w:link w:val="Subttulo"/>
+    <w:uiPriority w:val="11"/>
+    <w:rsid w:val="00A10FD9"/>
+    <w:rPr>
+      <w:rFonts w:eastAsiaTheme="majorEastAsia" w:cstheme="majorBidi"/>
+      <w:color w:val="595959" w:themeColor="text1" w:themeTint="A6"/>
+      <w:spacing w:val="15"/>
+      <w:sz w:val="28"/>
+      <w:szCs w:val="28"/>
+    </w:rPr>
+  </w:style>
+  <w:style w:type="paragraph" w:customStyle="1" w:styleId="Author">
+    <w:name w:val="Author"/>
+    <w:basedOn w:val="Ttulo"/>
+    <w:next w:val="Textoindependiente"/>
+    <w:qFormat/>
+    <w:pPr>
+      <w:keepNext/>
+      <w:keepLines/>
+    </w:pPr>
+    <w:rPr>
+      <w:sz w:val="24"/>
+      <w:szCs w:val="24"/>
+    </w:rPr>
+  </w:style>
+  <w:style w:type="paragraph" w:styleId="Fecha">
+    <w:name w:val="Date"/>
+    <w:basedOn w:val="Ttulo"/>
+    <w:next w:val="Textoindependiente"/>
+    <w:qFormat/>
+    <w:pPr>
+      <w:keepNext/>
+      <w:keepLines/>
+    </w:pPr>
+    <w:rPr>
+      <w:sz w:val="24"/>
+      <w:szCs w:val="24"/>
+    </w:rPr>
+  </w:style>
+  <w:style w:type="paragraph" w:customStyle="1" w:styleId="AbstractTitle">
+    <w:name w:val="Abstract Title"/>
+    <w:basedOn w:val="Normal"/>
+    <w:next w:val="Abstract"/>
+    <w:qFormat/>
+    <w:pPr>
+      <w:keepNext/>
+      <w:keepLines/>
+      <w:spacing w:before="300" w:after="0"/>
+      <w:jc w:val="center"/>
+    </w:pPr>
+    <w:rPr>
+      <w:b/>
+      <w:sz w:val="20"/>
+      <w:szCs w:val="20"/>
+    </w:rPr>
+  </w:style>
+  <w:style w:type="paragraph" w:customStyle="1" w:styleId="Abstract">
+    <w:name w:val="Abstract"/>
+    <w:basedOn w:val="Normal"/>
+    <w:next w:val="Textoindependiente"/>
+    <w:qFormat/>
+    <w:pPr>
+      <w:keepNext/>
+      <w:keepLines/>
+      <w:spacing w:before="100" w:after="300"/>
+    </w:pPr>
+    <w:rPr>
+      <w:sz w:val="20"/>
+      <w:szCs w:val="20"/>
+    </w:rPr>
+  </w:style>
+  <w:style w:type="paragraph" w:styleId="Bibliografa">
+    <w:name w:val="Bibliography"/>
+    <w:basedOn w:val="Normal"/>
+    <w:qFormat/>
+  </w:style>
+  <w:style w:type="character" w:customStyle="1" w:styleId="Ttulo1Car">
+    <w:name w:val="Título 1 Car"/>
+    <w:basedOn w:val="Fuentedeprrafopredeter"/>
+    <w:link w:val="Ttulo1"/>
     <w:uiPriority w:val="9"/>
     <w:rsid w:val="00A10FD9"/>
     <w:rPr>
-      <w:rFonts w:asciiTheme="majorHAnsi" w:cstheme="majorBidi" w:eastAsiaTheme="majorEastAsia" w:hAnsiTheme="majorHAnsi"/>
-      <w:color w:themeColor="accent1" w:themeShade="BF" w:val="0F4761"/>
+      <w:rFonts w:asciiTheme="majorHAnsi" w:eastAsiaTheme="majorEastAsia" w:hAnsiTheme="majorHAnsi" w:cstheme="majorBidi"/>
+      <w:color w:val="0F4761" w:themeColor="accent1" w:themeShade="BF"/>
       <w:sz w:val="40"/>
       <w:szCs w:val="40"/>
     </w:rPr>
   </w:style>
-  <w:style w:customStyle="1" w:styleId="Heading2Char" w:type="character">
-    <w:name w:val="Heading 2 Char"/>
-    <w:basedOn w:val="DefaultParagraphFont"/>
-    <w:link w:val="Heading2"/>
+  <w:style w:type="character" w:customStyle="1" w:styleId="Ttulo2Car">
+    <w:name w:val="Título 2 Car"/>
+    <w:basedOn w:val="Fuentedeprrafopredeter"/>
+    <w:link w:val="Ttulo2"/>
     <w:uiPriority w:val="9"/>
     <w:semiHidden/>
     <w:rsid w:val="00A10FD9"/>
     <w:rPr>
-      <w:rFonts w:asciiTheme="majorHAnsi" w:cstheme="majorBidi" w:eastAsiaTheme="majorEastAsia" w:hAnsiTheme="majorHAnsi"/>
-      <w:color w:themeColor="accent1" w:themeShade="BF" w:val="0F4761"/>
+      <w:rFonts w:asciiTheme="majorHAnsi" w:eastAsiaTheme="majorEastAsia" w:hAnsiTheme="majorHAnsi" w:cstheme="majorBidi"/>
+      <w:color w:val="0F4761" w:themeColor="accent1" w:themeShade="BF"/>
       <w:sz w:val="32"/>
       <w:szCs w:val="32"/>
     </w:rPr>
   </w:style>
-  <w:style w:customStyle="1" w:styleId="Heading3Char" w:type="character">
-    <w:name w:val="Heading 3 Char"/>
-    <w:basedOn w:val="DefaultParagraphFont"/>
-    <w:link w:val="Heading3"/>
+  <w:style w:type="character" w:customStyle="1" w:styleId="Ttulo3Car">
+    <w:name w:val="Título 3 Car"/>
+    <w:basedOn w:val="Fuentedeprrafopredeter"/>
+    <w:link w:val="Ttulo3"/>
     <w:uiPriority w:val="9"/>
     <w:semiHidden/>
     <w:rsid w:val="00A10FD9"/>
     <w:rPr>
-      <w:rFonts w:cstheme="majorBidi" w:eastAsiaTheme="majorEastAsia"/>
-      <w:color w:themeColor="accent1" w:themeShade="BF" w:val="0F4761"/>
+      <w:rFonts w:eastAsiaTheme="majorEastAsia" w:cstheme="majorBidi"/>
+      <w:color w:val="0F4761" w:themeColor="accent1" w:themeShade="BF"/>
       <w:sz w:val="28"/>
       <w:szCs w:val="28"/>
     </w:rPr>
   </w:style>
-  <w:style w:customStyle="1" w:styleId="Heading4Char" w:type="character">
-    <w:name w:val="Heading 4 Char"/>
-    <w:basedOn w:val="DefaultParagraphFont"/>
-    <w:link w:val="Heading4"/>
+  <w:style w:type="character" w:customStyle="1" w:styleId="Ttulo4Car">
+    <w:name w:val="Título 4 Car"/>
+    <w:basedOn w:val="Fuentedeprrafopredeter"/>
+    <w:link w:val="Ttulo4"/>
     <w:uiPriority w:val="9"/>
     <w:semiHidden/>
     <w:rsid w:val="00A10FD9"/>
     <w:rPr>
-      <w:rFonts w:cstheme="majorBidi" w:eastAsiaTheme="majorEastAsia"/>
+      <w:rFonts w:eastAsiaTheme="majorEastAsia" w:cstheme="majorBidi"/>
       <w:i/>
       <w:iCs/>
-      <w:color w:themeColor="accent1" w:themeShade="BF" w:val="0F4761"/>
-    </w:rPr>
-  </w:style>
-  <w:style w:customStyle="1" w:styleId="Heading5Char" w:type="character">
-    <w:name w:val="Heading 5 Char"/>
-    <w:basedOn w:val="DefaultParagraphFont"/>
-    <w:link w:val="Heading5"/>
+      <w:color w:val="0F4761" w:themeColor="accent1" w:themeShade="BF"/>
+    </w:rPr>
+  </w:style>
+  <w:style w:type="character" w:customStyle="1" w:styleId="Ttulo5Car">
+    <w:name w:val="Título 5 Car"/>
+    <w:basedOn w:val="Fuentedeprrafopredeter"/>
+    <w:link w:val="Ttulo5"/>
     <w:uiPriority w:val="9"/>
     <w:semiHidden/>
     <w:rsid w:val="00A10FD9"/>
     <w:rPr>
-      <w:rFonts w:cstheme="majorBidi" w:eastAsiaTheme="majorEastAsia"/>
-      <w:color w:themeColor="accent1" w:themeShade="BF" w:val="0F4761"/>
-    </w:rPr>
-  </w:style>
-  <w:style w:customStyle="1" w:styleId="Heading6Char" w:type="character">
-    <w:name w:val="Heading 6 Char"/>
-    <w:basedOn w:val="DefaultParagraphFont"/>
-    <w:link w:val="Heading6"/>
+      <w:rFonts w:eastAsiaTheme="majorEastAsia" w:cstheme="majorBidi"/>
+      <w:color w:val="0F4761" w:themeColor="accent1" w:themeShade="BF"/>
+    </w:rPr>
+  </w:style>
+  <w:style w:type="character" w:customStyle="1" w:styleId="Ttulo6Car">
+    <w:name w:val="Título 6 Car"/>
+    <w:basedOn w:val="Fuentedeprrafopredeter"/>
+    <w:link w:val="Ttulo6"/>
     <w:uiPriority w:val="9"/>
     <w:semiHidden/>
     <w:rsid w:val="00A10FD9"/>
     <w:rPr>
-      <w:rFonts w:cstheme="majorBidi" w:eastAsiaTheme="majorEastAsia"/>
+      <w:rFonts w:eastAsiaTheme="majorEastAsia" w:cstheme="majorBidi"/>
       <w:i/>
       <w:iCs/>
-      <w:color w:themeColor="text1" w:themeTint="A6" w:val="595959"/>
-    </w:rPr>
-  </w:style>
-  <w:style w:customStyle="1" w:styleId="Heading7Char" w:type="character">
-    <w:name w:val="Heading 7 Char"/>
-    <w:basedOn w:val="DefaultParagraphFont"/>
-    <w:link w:val="Heading7"/>
+      <w:color w:val="595959" w:themeColor="text1" w:themeTint="A6"/>
+    </w:rPr>
+  </w:style>
+  <w:style w:type="character" w:customStyle="1" w:styleId="Ttulo7Car">
+    <w:name w:val="Título 7 Car"/>
+    <w:basedOn w:val="Fuentedeprrafopredeter"/>
+    <w:link w:val="Ttulo7"/>
     <w:uiPriority w:val="9"/>
     <w:semiHidden/>
     <w:rsid w:val="00A10FD9"/>
     <w:rPr>
-      <w:rFonts w:cstheme="majorBidi" w:eastAsiaTheme="majorEastAsia"/>
-      <w:color w:themeColor="text1" w:themeTint="A6" w:val="595959"/>
-    </w:rPr>
-  </w:style>
-  <w:style w:customStyle="1" w:styleId="Heading8Char" w:type="character">
-    <w:name w:val="Heading 8 Char"/>
-    <w:basedOn w:val="DefaultParagraphFont"/>
-    <w:link w:val="Heading8"/>
+      <w:rFonts w:eastAsiaTheme="majorEastAsia" w:cstheme="majorBidi"/>
+      <w:color w:val="595959" w:themeColor="text1" w:themeTint="A6"/>
+    </w:rPr>
+  </w:style>
+  <w:style w:type="character" w:customStyle="1" w:styleId="Ttulo8Car">
+    <w:name w:val="Título 8 Car"/>
+    <w:basedOn w:val="Fuentedeprrafopredeter"/>
+    <w:link w:val="Ttulo8"/>
     <w:uiPriority w:val="9"/>
     <w:semiHidden/>
     <w:rsid w:val="00A10FD9"/>
     <w:rPr>
-      <w:rFonts w:cstheme="majorBidi" w:eastAsiaTheme="majorEastAsia"/>
+      <w:rFonts w:eastAsiaTheme="majorEastAsia" w:cstheme="majorBidi"/>
       <w:i/>
       <w:iCs/>
-      <w:color w:themeColor="text1" w:themeTint="D8" w:val="272727"/>
-    </w:rPr>
-  </w:style>
-  <w:style w:customStyle="1" w:styleId="Heading9Char" w:type="character">
-    <w:name w:val="Heading 9 Char"/>
-    <w:basedOn w:val="DefaultParagraphFont"/>
-    <w:link w:val="Heading9"/>
+      <w:color w:val="272727" w:themeColor="text1" w:themeTint="D8"/>
+    </w:rPr>
+  </w:style>
+  <w:style w:type="character" w:customStyle="1" w:styleId="Ttulo9Car">
+    <w:name w:val="Título 9 Car"/>
+    <w:basedOn w:val="Fuentedeprrafopredeter"/>
+    <w:link w:val="Ttulo9"/>
     <w:uiPriority w:val="9"/>
     <w:semiHidden/>
     <w:rsid w:val="00A10FD9"/>
     <w:rPr>
-      <w:rFonts w:cstheme="majorBidi" w:eastAsiaTheme="majorEastAsia"/>
-      <w:color w:themeColor="text1" w:themeTint="D8" w:val="272727"/>
-    </w:rPr>
-  </w:style>
-  <w:style w:styleId="BlockText" w:type="paragraph">
+      <w:rFonts w:eastAsiaTheme="majorEastAsia" w:cstheme="majorBidi"/>
+      <w:color w:val="272727" w:themeColor="text1" w:themeTint="D8"/>
+    </w:rPr>
+  </w:style>
+  <w:style w:type="paragraph" w:styleId="Textodebloque">
     <w:name w:val="Block Text"/>
-    <w:basedOn w:val="BodyText"/>
-    <w:next w:val="BodyText"/>
+    <w:basedOn w:val="Textoindependiente"/>
+    <w:next w:val="Textoindependiente"/>
     <w:uiPriority w:val="9"/>
     <w:unhideWhenUsed/>
     <w:qFormat/>
     <w:pPr>
-      <w:spacing w:after="100" w:before="100"/>
-      <w:ind w:firstLine="0" w:left="480" w:right="480"/>
+      <w:spacing w:before="100" w:after="100"/>
+      <w:ind w:left="480" w:right="480"/>
     </w:pPr>
   </w:style>
-  <w:style w:styleId="FootnoteText" w:type="paragraph">
-    <w:name w:val="Footnote Text"/>
+  <w:style w:type="paragraph" w:styleId="Textonotapie">
+    <w:name w:val="footnote text"/>
     <w:basedOn w:val="Normal"/>
-    <w:next w:val="FootnoteText"/>
     <w:uiPriority w:val="9"/>
     <w:unhideWhenUsed/>
     <w:qFormat/>
   </w:style>
-  <w:style w:styleId="FootnoteBlockText" w:type="paragraph">
+  <w:style w:type="paragraph" w:customStyle="1" w:styleId="FootnoteBlockText">
     <w:name w:val="Footnote Block Text"/>
-    <w:basedOn w:val="FootnoteText"/>
-    <w:next w:val="FootnoteText"/>
+    <w:basedOn w:val="Textonotapie"/>
+    <w:next w:val="Textonotapie"/>
     <w:uiPriority w:val="9"/>
     <w:unhideWhenUsed/>
     <w:qFormat/>
     <w:pPr>
-      <w:spacing w:after="100" w:before="100"/>
-      <w:ind w:firstLine="0" w:left="480" w:right="480"/>
+      <w:spacing w:before="100" w:after="100"/>
+      <w:ind w:left="480" w:right="480"/>
     </w:pPr>
   </w:style>
-  <w:style w:default="1" w:styleId="DefaultParagraphFont" w:type="character">
-    <w:name w:val="Default Paragraph Font"/>
-    <w:semiHidden/>
-    <w:unhideWhenUsed/>
-  </w:style>
-  <w:style w:default="1" w:styleId="Table" w:type="table">
+  <w:style w:type="table" w:customStyle="1" w:styleId="Table">
     <w:name w:val="Table"/>
-    <w:basedOn w:val="TableNormal"/>
     <w:semiHidden/>
     <w:unhideWhenUsed/>
     <w:qFormat/>
     <w:tblPr>
-      <w:tblInd w:type="dxa" w:w="0"/>
+      <w:tblInd w:w="0" w:type="dxa"/>
       <w:tblCellMar>
-        <w:top w:type="dxa" w:w="0"/>
-        <w:left w:type="dxa" w:w="108"/>
-        <w:bottom w:type="dxa" w:w="0"/>
-        <w:right w:type="dxa" w:w="108"/>
+        <w:top w:w="0" w:type="dxa"/>
+        <w:left w:w="108" w:type="dxa"/>
+        <w:bottom w:w="0" w:type="dxa"/>
+        <w:right w:w="108" w:type="dxa"/>
       </w:tblCellMar>
     </w:tblPr>
     <w:tblStylePr w:type="firstRow">
+      <w:tblPr/>
       <w:tcPr>
         <w:tcBorders>
-          <w:bottom w:val="single"/>
+          <w:bottom w:val="single" w:sz="0" w:space="0" w:color="auto"/>
         </w:tcBorders>
         <w:vAlign w:val="bottom"/>
       </w:tcPr>
     </w:tblStylePr>
   </w:style>
-  <w:style w:customStyle="1" w:styleId="DefinitionTerm" w:type="paragraph">
+  <w:style w:type="paragraph" w:customStyle="1" w:styleId="DefinitionTerm">
     <w:name w:val="Definition Term"/>
     <w:basedOn w:val="Normal"/>
     <w:next w:val="Definition"/>
@@ -2707,78 +3124,79 @@
       <w:b/>
     </w:rPr>
   </w:style>
-  <w:style w:customStyle="1" w:styleId="Definition" w:type="paragraph">
+  <w:style w:type="paragraph" w:customStyle="1" w:styleId="Definition">
     <w:name w:val="Definition"/>
     <w:basedOn w:val="Normal"/>
   </w:style>
-  <w:style w:styleId="Caption" w:type="paragraph">
-    <w:name w:val="Caption"/>
+  <w:style w:type="paragraph" w:styleId="Descripcin">
+    <w:name w:val="caption"/>
     <w:basedOn w:val="Normal"/>
-    <w:link w:val="BodyTextChar"/>
+    <w:link w:val="DescripcinCar"/>
     <w:pPr>
-      <w:spacing w:after="120" w:before="0"/>
+      <w:spacing w:after="120"/>
     </w:pPr>
     <w:rPr>
       <w:i/>
     </w:rPr>
   </w:style>
-  <w:style w:customStyle="1" w:styleId="TableCaption" w:type="paragraph">
+  <w:style w:type="paragraph" w:customStyle="1" w:styleId="TableCaption">
     <w:name w:val="Table Caption"/>
-    <w:basedOn w:val="Caption"/>
+    <w:basedOn w:val="Descripcin"/>
     <w:pPr>
       <w:keepNext/>
     </w:pPr>
   </w:style>
-  <w:style w:customStyle="1" w:styleId="ImageCaption" w:type="paragraph">
+  <w:style w:type="paragraph" w:customStyle="1" w:styleId="ImageCaption">
     <w:name w:val="Image Caption"/>
-    <w:basedOn w:val="Caption"/>
-  </w:style>
-  <w:style w:customStyle="1" w:styleId="Figure" w:type="paragraph">
+    <w:basedOn w:val="Descripcin"/>
+  </w:style>
+  <w:style w:type="paragraph" w:customStyle="1" w:styleId="Figure">
     <w:name w:val="Figure"/>
     <w:basedOn w:val="Normal"/>
   </w:style>
-  <w:style w:customStyle="1" w:styleId="CaptionedFigure" w:type="paragraph">
+  <w:style w:type="paragraph" w:customStyle="1" w:styleId="CaptionedFigure">
     <w:name w:val="Captioned Figure"/>
     <w:basedOn w:val="Figure"/>
     <w:pPr>
       <w:keepNext/>
     </w:pPr>
   </w:style>
-  <w:style w:customStyle="1" w:styleId="BodyTextChar" w:type="character">
-    <w:name w:val="Body Text Char"/>
-    <w:basedOn w:val="DefaultParagraphFont"/>
-    <w:link w:val="BodyText"/>
-  </w:style>
-  <w:style w:customStyle="1" w:styleId="VerbatimChar" w:type="character">
+  <w:style w:type="character" w:customStyle="1" w:styleId="DescripcinCar">
+    <w:name w:val="Descripción Car"/>
+    <w:basedOn w:val="Fuentedeprrafopredeter"/>
+    <w:link w:val="Descripcin"/>
+  </w:style>
+  <w:style w:type="character" w:customStyle="1" w:styleId="VerbatimChar">
     <w:name w:val="Verbatim Char"/>
-    <w:basedOn w:val="BodyTextChar"/>
+    <w:basedOn w:val="DescripcinCar"/>
+    <w:link w:val="SourceCode"/>
     <w:rPr>
       <w:rFonts w:ascii="Consolas" w:hAnsi="Consolas"/>
       <w:sz w:val="22"/>
     </w:rPr>
   </w:style>
-  <w:style w:customStyle="1" w:styleId="SectionNumber" w:type="character">
+  <w:style w:type="character" w:customStyle="1" w:styleId="SectionNumber">
     <w:name w:val="Section Number"/>
-    <w:basedOn w:val="BodyTextChar"/>
-  </w:style>
-  <w:style w:styleId="FootnoteReference" w:type="character">
-    <w:name w:val="Footnote Reference"/>
-    <w:basedOn w:val="BodyTextChar"/>
+    <w:basedOn w:val="DescripcinCar"/>
+  </w:style>
+  <w:style w:type="character" w:styleId="Refdenotaalpie">
+    <w:name w:val="footnote reference"/>
+    <w:basedOn w:val="DescripcinCar"/>
     <w:rPr>
       <w:vertAlign w:val="superscript"/>
     </w:rPr>
   </w:style>
-  <w:style w:styleId="Hyperlink" w:type="character">
+  <w:style w:type="character" w:styleId="Hipervnculo">
     <w:name w:val="Hyperlink"/>
-    <w:basedOn w:val="BodyTextChar"/>
-    <w:rPr>
-      <w:color w:themeColor="accent1" w:val="4F81BD"/>
-    </w:rPr>
-  </w:style>
-  <w:style w:styleId="TOCHeading" w:type="paragraph">
+    <w:basedOn w:val="DescripcinCar"/>
+    <w:rPr>
+      <w:color w:val="156082" w:themeColor="accent1"/>
+    </w:rPr>
+  </w:style>
+  <w:style w:type="paragraph" w:styleId="TtuloTDC">
     <w:name w:val="TOC Heading"/>
-    <w:basedOn w:val="Heading1"/>
-    <w:next w:val="BodyText"/>
+    <w:basedOn w:val="Ttulo1"/>
+    <w:next w:val="Textoindependiente"/>
     <w:uiPriority w:val="39"/>
     <w:unhideWhenUsed/>
     <w:qFormat/>
@@ -2786,246 +3204,305 @@
       <w:spacing w:before="240" w:line="259" w:lineRule="auto"/>
       <w:outlineLvl w:val="9"/>
     </w:pPr>
-    <w:rPr>
-      <w:rFonts w:asciiTheme="majorHAnsi" w:cstheme="majorBidi" w:eastAsiaTheme="majorEastAsia" w:hAnsiTheme="majorHAnsi"/>
-      <w:b w:val="0"/>
-      <w:bCs w:val="0"/>
-      <w:color w:themeColor="accent1" w:themeShade="BF" w:val="365F91"/>
-    </w:rPr>
   </w:style>
   <w:style w:type="paragraph" w:customStyle="1" w:styleId="SourceCode">
     <w:name w:val="Source Code"/>
     <w:basedOn w:val="Normal"/>
     <w:link w:val="VerbatimChar"/>
     <w:pPr>
-      <w:wordWrap w:val="off"/>
+      <w:wordWrap w:val="0"/>
     </w:pPr>
   </w:style>
   <w:style w:type="character" w:customStyle="1" w:styleId="KeywordTok">
     <w:name w:val="KeywordTok"/>
     <w:basedOn w:val="VerbatimChar"/>
     <w:rPr>
+      <w:rFonts w:ascii="Consolas" w:hAnsi="Consolas"/>
       <w:b/>
       <w:color w:val="007020"/>
+      <w:sz w:val="22"/>
     </w:rPr>
   </w:style>
   <w:style w:type="character" w:customStyle="1" w:styleId="DataTypeTok">
     <w:name w:val="DataTypeTok"/>
     <w:basedOn w:val="VerbatimChar"/>
     <w:rPr>
+      <w:rFonts w:ascii="Consolas" w:hAnsi="Consolas"/>
       <w:color w:val="902000"/>
+      <w:sz w:val="22"/>
     </w:rPr>
   </w:style>
   <w:style w:type="character" w:customStyle="1" w:styleId="DecValTok">
     <w:name w:val="DecValTok"/>
     <w:basedOn w:val="VerbatimChar"/>
     <w:rPr>
-      <w:color w:val="40a070"/>
+      <w:rFonts w:ascii="Consolas" w:hAnsi="Consolas"/>
+      <w:color w:val="40A070"/>
+      <w:sz w:val="22"/>
     </w:rPr>
   </w:style>
   <w:style w:type="character" w:customStyle="1" w:styleId="BaseNTok">
     <w:name w:val="BaseNTok"/>
     <w:basedOn w:val="VerbatimChar"/>
     <w:rPr>
-      <w:color w:val="40a070"/>
+      <w:rFonts w:ascii="Consolas" w:hAnsi="Consolas"/>
+      <w:color w:val="40A070"/>
+      <w:sz w:val="22"/>
     </w:rPr>
   </w:style>
   <w:style w:type="character" w:customStyle="1" w:styleId="FloatTok">
     <w:name w:val="FloatTok"/>
     <w:basedOn w:val="VerbatimChar"/>
     <w:rPr>
-      <w:color w:val="40a070"/>
+      <w:rFonts w:ascii="Consolas" w:hAnsi="Consolas"/>
+      <w:color w:val="40A070"/>
+      <w:sz w:val="22"/>
     </w:rPr>
   </w:style>
   <w:style w:type="character" w:customStyle="1" w:styleId="ConstantTok">
     <w:name w:val="ConstantTok"/>
     <w:basedOn w:val="VerbatimChar"/>
     <w:rPr>
+      <w:rFonts w:ascii="Consolas" w:hAnsi="Consolas"/>
       <w:color w:val="880000"/>
+      <w:sz w:val="22"/>
     </w:rPr>
   </w:style>
   <w:style w:type="character" w:customStyle="1" w:styleId="CharTok">
     <w:name w:val="CharTok"/>
     <w:basedOn w:val="VerbatimChar"/>
     <w:rPr>
-      <w:color w:val="4070a0"/>
+      <w:rFonts w:ascii="Consolas" w:hAnsi="Consolas"/>
+      <w:color w:val="4070A0"/>
+      <w:sz w:val="22"/>
     </w:rPr>
   </w:style>
   <w:style w:type="character" w:customStyle="1" w:styleId="SpecialCharTok">
     <w:name w:val="SpecialCharTok"/>
     <w:basedOn w:val="VerbatimChar"/>
     <w:rPr>
-      <w:color w:val="4070a0"/>
+      <w:rFonts w:ascii="Consolas" w:hAnsi="Consolas"/>
+      <w:color w:val="4070A0"/>
+      <w:sz w:val="22"/>
     </w:rPr>
   </w:style>
   <w:style w:type="character" w:customStyle="1" w:styleId="StringTok">
     <w:name w:val="StringTok"/>
     <w:basedOn w:val="VerbatimChar"/>
     <w:rPr>
-      <w:color w:val="4070a0"/>
+      <w:rFonts w:ascii="Consolas" w:hAnsi="Consolas"/>
+      <w:color w:val="4070A0"/>
+      <w:sz w:val="22"/>
     </w:rPr>
   </w:style>
   <w:style w:type="character" w:customStyle="1" w:styleId="VerbatimStringTok">
     <w:name w:val="VerbatimStringTok"/>
     <w:basedOn w:val="VerbatimChar"/>
     <w:rPr>
-      <w:color w:val="4070a0"/>
+      <w:rFonts w:ascii="Consolas" w:hAnsi="Consolas"/>
+      <w:color w:val="4070A0"/>
+      <w:sz w:val="22"/>
     </w:rPr>
   </w:style>
   <w:style w:type="character" w:customStyle="1" w:styleId="SpecialStringTok">
     <w:name w:val="SpecialStringTok"/>
     <w:basedOn w:val="VerbatimChar"/>
     <w:rPr>
-      <w:color w:val="bb6688"/>
+      <w:rFonts w:ascii="Consolas" w:hAnsi="Consolas"/>
+      <w:color w:val="BB6688"/>
+      <w:sz w:val="22"/>
     </w:rPr>
   </w:style>
   <w:style w:type="character" w:customStyle="1" w:styleId="ImportTok">
     <w:name w:val="ImportTok"/>
     <w:basedOn w:val="VerbatimChar"/>
     <w:rPr>
+      <w:rFonts w:ascii="Consolas" w:hAnsi="Consolas"/>
       <w:b/>
       <w:color w:val="008000"/>
+      <w:sz w:val="22"/>
     </w:rPr>
   </w:style>
   <w:style w:type="character" w:customStyle="1" w:styleId="CommentTok">
     <w:name w:val="CommentTok"/>
     <w:basedOn w:val="VerbatimChar"/>
     <w:rPr>
+      <w:rFonts w:ascii="Consolas" w:hAnsi="Consolas"/>
       <w:i/>
-      <w:color w:val="60a0b0"/>
+      <w:color w:val="60A0B0"/>
+      <w:sz w:val="22"/>
     </w:rPr>
   </w:style>
   <w:style w:type="character" w:customStyle="1" w:styleId="DocumentationTok">
     <w:name w:val="DocumentationTok"/>
     <w:basedOn w:val="VerbatimChar"/>
     <w:rPr>
+      <w:rFonts w:ascii="Consolas" w:hAnsi="Consolas"/>
       <w:i/>
-      <w:color w:val="ba2121"/>
+      <w:color w:val="BA2121"/>
+      <w:sz w:val="22"/>
     </w:rPr>
   </w:style>
   <w:style w:type="character" w:customStyle="1" w:styleId="AnnotationTok">
     <w:name w:val="AnnotationTok"/>
     <w:basedOn w:val="VerbatimChar"/>
     <w:rPr>
+      <w:rFonts w:ascii="Consolas" w:hAnsi="Consolas"/>
       <w:b/>
       <w:i/>
-      <w:color w:val="60a0b0"/>
+      <w:color w:val="60A0B0"/>
+      <w:sz w:val="22"/>
     </w:rPr>
   </w:style>
   <w:style w:type="character" w:customStyle="1" w:styleId="CommentVarTok">
     <w:name w:val="CommentVarTok"/>
     <w:basedOn w:val="VerbatimChar"/>
     <w:rPr>
+      <w:rFonts w:ascii="Consolas" w:hAnsi="Consolas"/>
       <w:b/>
       <w:i/>
-      <w:color w:val="60a0b0"/>
+      <w:color w:val="60A0B0"/>
+      <w:sz w:val="22"/>
     </w:rPr>
   </w:style>
   <w:style w:type="character" w:customStyle="1" w:styleId="OtherTok">
     <w:name w:val="OtherTok"/>
     <w:basedOn w:val="VerbatimChar"/>
     <w:rPr>
+      <w:rFonts w:ascii="Consolas" w:hAnsi="Consolas"/>
       <w:color w:val="007020"/>
+      <w:sz w:val="22"/>
     </w:rPr>
   </w:style>
   <w:style w:type="character" w:customStyle="1" w:styleId="FunctionTok">
     <w:name w:val="FunctionTok"/>
     <w:basedOn w:val="VerbatimChar"/>
     <w:rPr>
-      <w:color w:val="06287e"/>
+      <w:rFonts w:ascii="Consolas" w:hAnsi="Consolas"/>
+      <w:color w:val="06287E"/>
+      <w:sz w:val="22"/>
     </w:rPr>
   </w:style>
   <w:style w:type="character" w:customStyle="1" w:styleId="VariableTok">
     <w:name w:val="VariableTok"/>
     <w:basedOn w:val="VerbatimChar"/>
     <w:rPr>
-      <w:color w:val="19177c"/>
+      <w:rFonts w:ascii="Consolas" w:hAnsi="Consolas"/>
+      <w:color w:val="19177C"/>
+      <w:sz w:val="22"/>
     </w:rPr>
   </w:style>
   <w:style w:type="character" w:customStyle="1" w:styleId="ControlFlowTok">
     <w:name w:val="ControlFlowTok"/>
     <w:basedOn w:val="VerbatimChar"/>
     <w:rPr>
+      <w:rFonts w:ascii="Consolas" w:hAnsi="Consolas"/>
       <w:b/>
       <w:color w:val="007020"/>
+      <w:sz w:val="22"/>
     </w:rPr>
   </w:style>
   <w:style w:type="character" w:customStyle="1" w:styleId="OperatorTok">
     <w:name w:val="OperatorTok"/>
     <w:basedOn w:val="VerbatimChar"/>
     <w:rPr>
+      <w:rFonts w:ascii="Consolas" w:hAnsi="Consolas"/>
       <w:color w:val="666666"/>
+      <w:sz w:val="22"/>
     </w:rPr>
   </w:style>
   <w:style w:type="character" w:customStyle="1" w:styleId="BuiltInTok">
     <w:name w:val="BuiltInTok"/>
     <w:basedOn w:val="VerbatimChar"/>
     <w:rPr>
+      <w:rFonts w:ascii="Consolas" w:hAnsi="Consolas"/>
       <w:color w:val="008000"/>
+      <w:sz w:val="22"/>
     </w:rPr>
   </w:style>
   <w:style w:type="character" w:customStyle="1" w:styleId="ExtensionTok">
     <w:name w:val="ExtensionTok"/>
     <w:basedOn w:val="VerbatimChar"/>
-    <w:rPr/>
+    <w:rPr>
+      <w:rFonts w:ascii="Consolas" w:hAnsi="Consolas"/>
+      <w:sz w:val="22"/>
+    </w:rPr>
   </w:style>
   <w:style w:type="character" w:customStyle="1" w:styleId="PreprocessorTok">
     <w:name w:val="PreprocessorTok"/>
     <w:basedOn w:val="VerbatimChar"/>
     <w:rPr>
-      <w:color w:val="bc7a00"/>
+      <w:rFonts w:ascii="Consolas" w:hAnsi="Consolas"/>
+      <w:color w:val="BC7A00"/>
+      <w:sz w:val="22"/>
     </w:rPr>
   </w:style>
   <w:style w:type="character" w:customStyle="1" w:styleId="AttributeTok">
     <w:name w:val="AttributeTok"/>
     <w:basedOn w:val="VerbatimChar"/>
     <w:rPr>
-      <w:color w:val="7d9029"/>
+      <w:rFonts w:ascii="Consolas" w:hAnsi="Consolas"/>
+      <w:color w:val="7D9029"/>
+      <w:sz w:val="22"/>
     </w:rPr>
   </w:style>
   <w:style w:type="character" w:customStyle="1" w:styleId="RegionMarkerTok">
     <w:name w:val="RegionMarkerTok"/>
     <w:basedOn w:val="VerbatimChar"/>
-    <w:rPr/>
+    <w:rPr>
+      <w:rFonts w:ascii="Consolas" w:hAnsi="Consolas"/>
+      <w:sz w:val="22"/>
+    </w:rPr>
   </w:style>
   <w:style w:type="character" w:customStyle="1" w:styleId="InformationTok">
     <w:name w:val="InformationTok"/>
     <w:basedOn w:val="VerbatimChar"/>
     <w:rPr>
+      <w:rFonts w:ascii="Consolas" w:hAnsi="Consolas"/>
       <w:b/>
       <w:i/>
-      <w:color w:val="60a0b0"/>
+      <w:color w:val="60A0B0"/>
+      <w:sz w:val="22"/>
     </w:rPr>
   </w:style>
   <w:style w:type="character" w:customStyle="1" w:styleId="WarningTok">
     <w:name w:val="WarningTok"/>
     <w:basedOn w:val="VerbatimChar"/>
     <w:rPr>
+      <w:rFonts w:ascii="Consolas" w:hAnsi="Consolas"/>
       <w:b/>
       <w:i/>
-      <w:color w:val="60a0b0"/>
+      <w:color w:val="60A0B0"/>
+      <w:sz w:val="22"/>
     </w:rPr>
   </w:style>
   <w:style w:type="character" w:customStyle="1" w:styleId="AlertTok">
     <w:name w:val="AlertTok"/>
     <w:basedOn w:val="VerbatimChar"/>
     <w:rPr>
+      <w:rFonts w:ascii="Consolas" w:hAnsi="Consolas"/>
       <w:b/>
-      <w:color w:val="ff0000"/>
+      <w:color w:val="FF0000"/>
+      <w:sz w:val="22"/>
     </w:rPr>
   </w:style>
   <w:style w:type="character" w:customStyle="1" w:styleId="ErrorTok">
     <w:name w:val="ErrorTok"/>
     <w:basedOn w:val="VerbatimChar"/>
     <w:rPr>
+      <w:rFonts w:ascii="Consolas" w:hAnsi="Consolas"/>
       <w:b/>
-      <w:color w:val="ff0000"/>
+      <w:color w:val="FF0000"/>
+      <w:sz w:val="22"/>
     </w:rPr>
   </w:style>
   <w:style w:type="character" w:customStyle="1" w:styleId="NormalTok">
     <w:name w:val="NormalTok"/>
     <w:basedOn w:val="VerbatimChar"/>
-    <w:rPr/>
+    <w:rPr>
+      <w:rFonts w:ascii="Consolas" w:hAnsi="Consolas"/>
+      <w:sz w:val="22"/>
+    </w:rPr>
   </w:style>
 </w:styles>
 </file>

</xml_diff>